<commit_message>
Clean repo: remove dev artifacts, update figures and paper
- Remove palette_preview, Fig4/candidates, baselines folders
- Remove dev scripts (gen_fig4_timeseries, make_baseline_charts, preview_*)
- Add qoe_paired_winrate (Fig3), update Fig3-Fig7 and paper

Co-Authored-By: Claude Sonnet 4.6 <noreply@anthropic.com>
</commit_message>
<xml_diff>
--- a/docs/conference-template-a4.docx
+++ b/docs/conference-template-a4.docx
@@ -156,7 +156,14 @@
           <w:sz w:val="18"/>
           <w:szCs w:val="18"/>
         </w:rPr>
-        <w:t>M_mazinani@modares.ac.</w:t>
+        <w:t>m</w:t>
+      </w:r>
+      <w:r>
+        <w:rPr>
+          <w:sz w:val="18"/>
+          <w:szCs w:val="18"/>
+        </w:rPr>
+        <w:t>_mazinani@modares.ac.</w:t>
       </w:r>
       <w:r>
         <w:rPr>
@@ -364,220 +371,72 @@
     <w:p>
       <w:pPr>
         <w:pStyle w:val="Abstract"/>
+        <w:ind w:firstLine="13.70pt"/>
         <w:rPr>
           <w:i/>
           <w:iCs/>
         </w:rPr>
       </w:pPr>
-    </w:p>
-    <w:p>
-      <w:pPr>
-        <w:pStyle w:val="Abstract"/>
+      <w:r>
         <w:rPr>
           <w:i/>
           <w:iCs/>
         </w:rPr>
-      </w:pPr>
-      <w:r>
-        <w:rPr>
-          <w:i/>
-          <w:iCs/>
-        </w:rPr>
         <w:t>Abstract</w:t>
       </w:r>
       <w:r>
         <w:t>—</w:t>
       </w:r>
       <w:r>
-        <w:t xml:space="preserve">This electronic document is a “live” template and already defines the components of your paper [title, text, heads, etc.] in its style sheet. </w:t>
-      </w:r>
-      <w:r>
-        <w:t xml:space="preserve"> </w:t>
-      </w:r>
-      <w:r>
-        <w:rPr>
-          <w:i/>
-        </w:rPr>
-        <w:t>*</w:t>
-      </w:r>
-      <w:r>
-        <w:rPr>
-          <w:i/>
-        </w:rPr>
-        <w:t>CRITICAL:  Do</w:t>
-      </w:r>
-      <w:r>
-        <w:rPr>
-          <w:rFonts w:eastAsia="Times New Roman"/>
-          <w:i/>
-        </w:rPr>
-        <w:t xml:space="preserve"> </w:t>
-      </w:r>
-      <w:r>
-        <w:rPr>
-          <w:i/>
-        </w:rPr>
-        <w:t>Not</w:t>
-      </w:r>
-      <w:r>
-        <w:rPr>
-          <w:rFonts w:eastAsia="Times New Roman"/>
-          <w:i/>
-        </w:rPr>
-        <w:t xml:space="preserve"> </w:t>
-      </w:r>
-      <w:r>
-        <w:rPr>
-          <w:i/>
-        </w:rPr>
-        <w:t>Use</w:t>
-      </w:r>
-      <w:r>
-        <w:rPr>
-          <w:rFonts w:eastAsia="Times New Roman"/>
-          <w:i/>
-        </w:rPr>
-        <w:t xml:space="preserve"> </w:t>
-      </w:r>
-      <w:r>
-        <w:rPr>
-          <w:i/>
-        </w:rPr>
-        <w:t>Symbols,</w:t>
-      </w:r>
-      <w:r>
-        <w:rPr>
-          <w:rFonts w:eastAsia="Times New Roman"/>
-          <w:i/>
-        </w:rPr>
-        <w:t xml:space="preserve"> </w:t>
-      </w:r>
-      <w:r>
-        <w:rPr>
-          <w:i/>
-        </w:rPr>
-        <w:t>Special</w:t>
-      </w:r>
-      <w:r>
-        <w:rPr>
-          <w:rFonts w:eastAsia="Times New Roman"/>
-          <w:i/>
-        </w:rPr>
-        <w:t xml:space="preserve"> </w:t>
-      </w:r>
-      <w:r>
-        <w:rPr>
-          <w:i/>
-        </w:rPr>
-        <w:t>Characters,</w:t>
-      </w:r>
-      <w:r>
-        <w:rPr>
-          <w:rFonts w:eastAsia="Times New Roman"/>
-          <w:i/>
-        </w:rPr>
-        <w:t xml:space="preserve"> </w:t>
-      </w:r>
-      <w:r>
-        <w:rPr>
-          <w:rFonts w:eastAsia="Times New Roman"/>
-          <w:i/>
-        </w:rPr>
-        <w:t xml:space="preserve">Footnotes, </w:t>
-      </w:r>
-      <w:r>
-        <w:rPr>
-          <w:i/>
-        </w:rPr>
-        <w:t>or</w:t>
-      </w:r>
-      <w:r>
-        <w:rPr>
-          <w:rFonts w:eastAsia="Times New Roman"/>
-          <w:i/>
-        </w:rPr>
-        <w:t xml:space="preserve"> </w:t>
-      </w:r>
-      <w:r>
-        <w:rPr>
-          <w:i/>
-        </w:rPr>
-        <w:t>Math</w:t>
-      </w:r>
-      <w:r>
-        <w:rPr>
-          <w:rFonts w:eastAsia="Times New Roman"/>
-          <w:i/>
-        </w:rPr>
-        <w:t xml:space="preserve"> </w:t>
-      </w:r>
-      <w:r>
-        <w:rPr>
-          <w:i/>
-        </w:rPr>
-        <w:t>in</w:t>
-      </w:r>
-      <w:r>
-        <w:rPr>
-          <w:rFonts w:eastAsia="Times New Roman"/>
-          <w:i/>
-        </w:rPr>
-        <w:t xml:space="preserve"> Paper </w:t>
-      </w:r>
-      <w:r>
-        <w:rPr>
-          <w:i/>
-        </w:rPr>
-        <w:t>Title</w:t>
-      </w:r>
-      <w:r>
-        <w:rPr>
-          <w:rFonts w:eastAsia="Times New Roman"/>
-          <w:i/>
-        </w:rPr>
-        <w:t xml:space="preserve"> o</w:t>
-      </w:r>
-      <w:r>
-        <w:rPr>
-          <w:i/>
-        </w:rPr>
-        <w:t>r</w:t>
-      </w:r>
-      <w:r>
-        <w:rPr>
-          <w:rFonts w:eastAsia="Times New Roman"/>
-          <w:i/>
-        </w:rPr>
-        <w:t xml:space="preserve"> </w:t>
-      </w:r>
-      <w:r>
-        <w:rPr>
-          <w:i/>
-        </w:rPr>
-        <w:t>Abstract</w:t>
-      </w:r>
-      <w:r>
-        <w:t xml:space="preserve">. </w:t>
-      </w:r>
-      <w:r>
-        <w:rPr>
-          <w:iCs/>
-        </w:rPr>
-        <w:t>(</w:t>
-      </w:r>
-      <w:r>
-        <w:rPr>
-          <w:b w:val="0"/>
-          <w:i/>
-          <w:iCs/>
-        </w:rPr>
-        <w:t>Abstract</w:t>
-      </w:r>
-      <w:r>
-        <w:rPr>
-          <w:iCs/>
-        </w:rPr>
-        <w:t>)</w:t>
+        <w:t xml:space="preserve">High-quality point clouds enable immersive volumetric media, but their extreme bandwidth demands make adaptive streaming over mobile networks an open challenge. This paper presents a learning-based adaptive bitrate (ABR) controller for point cloud streaming. Four sequences of the 8i </w:t>
+      </w:r>
+      <w:proofErr w:type="spellStart"/>
+      <w:r>
+        <w:t>Voxelized</w:t>
+      </w:r>
+      <w:proofErr w:type="spellEnd"/>
+      <w:r>
+        <w:t xml:space="preserve"> Full Bodies dataset are encoded with the MPEG Geometry-based Point Cloud Compression (G-PCC) reference codec into a six-tier quality ladder and streamed as DASH-style segments over a trace-driven 5G simulator built from a public Irish 5G dataset with its measured 72 </w:t>
+      </w:r>
+      <w:proofErr w:type="spellStart"/>
+      <w:r>
+        <w:t>ms</w:t>
+      </w:r>
+      <w:proofErr w:type="spellEnd"/>
+      <w:r>
+        <w:t xml:space="preserve"> round-trip time. Per-frame fetching cannot sustain 30 frames per second at this latency; a segment-size sweep shows a quality-of-experience (</w:t>
+      </w:r>
+      <w:proofErr w:type="spellStart"/>
+      <w:r>
+        <w:t>QoE</w:t>
+      </w:r>
+      <w:proofErr w:type="spellEnd"/>
+      <w:r>
+        <w:t xml:space="preserve">) peak at ten frames per request, which the final system adopts together with request pacing that admits a segment only when it fits the client buffer. A Double Deep Q-Network agent is trained with the same five-term objective used for evaluation—normalized quality minus stall duration, rebuffering-event frequency, segment-quality changes, and startup delay—so that its discounted return equals the reported </w:t>
+      </w:r>
+      <w:proofErr w:type="spellStart"/>
+      <w:r>
+        <w:t>QoE</w:t>
+      </w:r>
+      <w:proofErr w:type="spellEnd"/>
+      <w:r>
+        <w:t xml:space="preserve"> exactly. On a registered, once-only test split of four held-out traces evaluated across all four sequences, the learned policy reaches a </w:t>
+      </w:r>
+      <w:proofErr w:type="spellStart"/>
+      <w:r>
+        <w:t>QoE</w:t>
+      </w:r>
+      <w:proofErr w:type="spellEnd"/>
+      <w:r>
+        <w:t xml:space="preserve"> of 49.9, improving on the buffer-based and model-predictive-control (MPC) baselines by about 9 percent and on the best fixed-quality arm by 59 percent, and it wins 83 percent of matched scenarios against MPC. Across twelve training seeds the test </w:t>
+      </w:r>
+      <w:proofErr w:type="spellStart"/>
+      <w:r>
+        <w:t>QoE</w:t>
+      </w:r>
+      <w:proofErr w:type="spellEnd"/>
+      <w:r>
+        <w:t xml:space="preserve"> holds at 49.9 ± 0.95.</w:t>
       </w:r>
     </w:p>
     <w:p>
@@ -588,40 +447,7 @@
         <w:t>Keywords—</w:t>
       </w:r>
       <w:r>
-        <w:t>component</w:t>
-      </w:r>
-      <w:r>
-        <w:t>,</w:t>
-      </w:r>
-      <w:r>
-        <w:t xml:space="preserve"> formatting</w:t>
-      </w:r>
-      <w:r>
-        <w:t>,</w:t>
-      </w:r>
-      <w:r>
-        <w:t xml:space="preserve"> style</w:t>
-      </w:r>
-      <w:r>
-        <w:t>,</w:t>
-      </w:r>
-      <w:r>
-        <w:t xml:space="preserve"> styling</w:t>
-      </w:r>
-      <w:r>
-        <w:t>,</w:t>
-      </w:r>
-      <w:r>
-        <w:t xml:space="preserve"> insert (</w:t>
-      </w:r>
-      <w:r>
-        <w:rPr>
-          <w:b w:val="0"/>
-        </w:rPr>
-        <w:t>key words</w:t>
-      </w:r>
-      <w:r>
-        <w:t>)</w:t>
+        <w:t>point cloud streaming, adaptive bitrate, deep reinforcement learning, G-PCC, MPEG-DASH, 5G, quality of experience</w:t>
       </w:r>
     </w:p>
     <w:p>
@@ -629,177 +455,49 @@
         <w:pStyle w:val="Heading1"/>
       </w:pPr>
       <w:r>
-        <w:t>Introduction (</w:t>
-      </w:r>
-      <w:r>
-        <w:rPr>
-          <w:rFonts w:eastAsia="MS Mincho"/>
-          <w:i/>
-        </w:rPr>
-        <w:t>Heading 1</w:t>
-      </w:r>
-      <w:r>
-        <w:t>)</w:t>
+        <w:t xml:space="preserve">Introduction </w:t>
       </w:r>
     </w:p>
     <w:p>
       <w:pPr>
         <w:pStyle w:val="BodyText"/>
-      </w:pPr>
-      <w:r>
-        <w:t xml:space="preserve">This template, </w:t>
-      </w:r>
-      <w:r>
-        <w:t>modified</w:t>
-      </w:r>
-      <w:r>
-        <w:t xml:space="preserve"> in MS Word 200</w:t>
-      </w:r>
-      <w:r>
         <w:rPr>
           <w:lang w:val="en-US"/>
         </w:rPr>
-        <w:t>7</w:t>
-      </w:r>
-      <w:r>
-        <w:t xml:space="preserve"> and saved as </w:t>
-      </w:r>
+      </w:pPr>
       <w:r>
         <w:rPr>
           <w:lang w:val="en-US"/>
         </w:rPr>
-        <w:t xml:space="preserve">a </w:t>
-      </w:r>
-      <w:r>
-        <w:t>“Word 97-200</w:t>
-      </w:r>
-      <w:r>
-        <w:t>3</w:t>
-      </w:r>
-      <w:r>
-        <w:t xml:space="preserve"> </w:t>
-      </w:r>
-      <w:r>
+        <w:t>Immersive volumetric media, such as holographic telepresence and augmented reality, are among the flagship services envisioned for 5G networks and beyond. Dynamic 3D point clouds are a natural representation for such media: each frame is a set of colored points that can be rendered from any viewpoint. Uncompressed, a single high-quality human-body sequence at 30 frames per second (fps) can exceed 6 Gbit/s [2]. Even after compression with the MPEG Geometry-based Point Cloud Compression standard (G-PCC) [4], [5], the highest quality tier used in this work requires 102.4 Mbit/s, which a mobile 5G link can deliver on average but not at every instant.</w:t>
+      </w:r>
+    </w:p>
+    <w:p>
+      <w:pPr>
+        <w:pStyle w:val="BodyText"/>
         <w:rPr>
           <w:lang w:val="en-US"/>
         </w:rPr>
-        <w:t>Document</w:t>
-      </w:r>
-      <w:r>
-        <w:t>” for the PC, provides authors with most of the formatting specifications needed for preparing electronic versions of their papers. All standard paper components have been specified for three reasons: (1) ease of use when formatting individual papers, (2) automatic compliance to electronic requirements that facilitate the concurrent or later production of electronic products, and (3) conformity of style throughout a conference proceedings. Margins, column widths, line spacing, and type styles are built-in; examples of the type styles are provided throughout this document and are identified in italic type, within parentheses, following the example. Some components, such as multi-leveled equations, graphics, and tables are not prescribed, although the various table text styles are provided. The formatter will need to create these components, incorporating the applicable criteria that follow.</w:t>
-      </w:r>
-    </w:p>
-    <w:p>
-      <w:pPr>
-        <w:pStyle w:val="Heading1"/>
-      </w:pPr>
-      <w:r>
-        <w:t>Ease of Use</w:t>
-      </w:r>
-    </w:p>
-    <w:p>
-      <w:pPr>
-        <w:pStyle w:val="Heading2"/>
-      </w:pPr>
-      <w:r>
-        <w:t xml:space="preserve">Selecting a </w:t>
-      </w:r>
-      <w:r>
-        <w:t>Template</w:t>
-      </w:r>
-      <w:r>
-        <w:t xml:space="preserve"> (Heading 2)</w:t>
-      </w:r>
-    </w:p>
-    <w:p>
-      <w:pPr>
-        <w:pStyle w:val="BodyText"/>
-      </w:pPr>
-      <w:r>
-        <w:t xml:space="preserve">First, confirm that you have the correct template for your paper size. This template has been tailored for output on the </w:t>
-      </w:r>
+      </w:pPr>
       <w:r>
         <w:rPr>
           <w:lang w:val="en-US"/>
         </w:rPr>
-        <w:t>A4</w:t>
-      </w:r>
-      <w:r>
-        <w:t xml:space="preserve"> paper size. If you are using </w:t>
-      </w:r>
+        <w:t xml:space="preserve">Dynamic Adaptive Streaming over HTTP (DASH) [1] addresses throughput variability by encoding content at multiple quality levels and letting the client select a level per segment. Hosseini and Timmerer extended this concept to point clouds with DASH-PC [3], using spatial sub-sampling to generate density representations. Their adaptation logic, like most deployed ABR schemes, is rule-based. For video, learning-based controllers such as </w:t>
+      </w:r>
+      <w:proofErr w:type="spellStart"/>
       <w:r>
         <w:rPr>
           <w:lang w:val="en-US"/>
         </w:rPr>
-        <w:t>US letter</w:t>
-      </w:r>
-      <w:r>
-        <w:t>-sized paper, please close this</w:t>
-      </w:r>
-      <w:r>
-        <w:t xml:space="preserve"> file and download the </w:t>
-      </w:r>
+        <w:t>Pensieve</w:t>
+      </w:r>
+      <w:proofErr w:type="spellEnd"/>
       <w:r>
         <w:rPr>
           <w:lang w:val="en-US"/>
         </w:rPr>
-        <w:t xml:space="preserve">Microsoft Word, Letter </w:t>
-      </w:r>
-      <w:r>
-        <w:t>file</w:t>
-      </w:r>
-      <w:r>
-        <w:t>.</w:t>
-      </w:r>
-    </w:p>
-    <w:p>
-      <w:pPr>
-        <w:pStyle w:val="Heading2"/>
-      </w:pPr>
-      <w:r>
-        <w:t>Maintaining the Integrity of the Specifications</w:t>
-      </w:r>
-    </w:p>
-    <w:p>
-      <w:pPr>
-        <w:pStyle w:val="BodyText"/>
-      </w:pPr>
-      <w:r>
-        <w:t>The template is used to format your paper and style the text. All margins, column widths, line spaces, and text fonts are prescribed; please do not alter them. You may note peculiarities. For example, the head margin in this template measures proportionately more than is customary. This measurement and others are deliberate, using specifications that anticipate your paper as one part of the entire proceedings, and not as an independent document. Please do not revise any of the current designations.</w:t>
-      </w:r>
-    </w:p>
-    <w:p>
-      <w:pPr>
-        <w:pStyle w:val="Heading1"/>
-      </w:pPr>
-      <w:r>
-        <w:t xml:space="preserve">Prepare Your Paper </w:t>
-      </w:r>
-      <w:r>
-        <w:t>Before</w:t>
-      </w:r>
-      <w:r>
-        <w:t xml:space="preserve"> Styling</w:t>
-      </w:r>
-    </w:p>
-    <w:p>
-      <w:pPr>
-        <w:pStyle w:val="BodyText"/>
-        <w:rPr>
-          <w:lang w:val="en-US"/>
-        </w:rPr>
-      </w:pPr>
-      <w:r>
-        <w:t>Before</w:t>
-      </w:r>
-      <w:r>
-        <w:t xml:space="preserve"> you begin to format your paper, first write and save the content as a separate text file. </w:t>
-      </w:r>
-      <w:r>
-        <w:rPr>
-          <w:lang w:val="en-US"/>
-        </w:rPr>
-        <w:t xml:space="preserve">Complete all content and organizational editing before formatting. Please note sections </w:t>
+        <w:t xml:space="preserve"> [6] have shown </w:t>
       </w:r>
     </w:p>
     <w:p>
@@ -814,15 +512,85 @@
         <w:rPr>
           <w:lang w:val="en-US"/>
         </w:rPr>
-        <w:t>A-D below for more information on proofreading, spelling and grammar.</w:t>
+        <w:t>that a policy trained with reinforcement learning (RL) can outperform hand-crafted rules. This idea is now being carried into volumetric media: recent work applies deep RL to real-time volumetric video streaming through rolling prediction-and-optimization [13] and to perceptual-quality-aware volumetric adaptation [14], while the broader shift toward learning-based adaptive streaming is charted in a recent tutorial and survey [15]. Applying it specifically to standard G-PCC point cloud streaming, however, raises challenges these works do not jointly address: the rate ladder spans two orders of magnitude, perceived quality is governed by point density and coding rate rather than pixel fidelity, and the interaction between the 5G round-trip time (RTT) and the request granularity determines whether stall-free playback is possible at all.</w:t>
       </w:r>
     </w:p>
     <w:p>
       <w:pPr>
         <w:pStyle w:val="BodyText"/>
-      </w:pPr>
-      <w:r>
-        <w:t>Keep your text and graphic files separate until after the text has been formatted and styled. Do not use hard tabs, and limit use of hard returns to only one return at the end of a paragraph. Do not add any kind of pagination anywhere in the paper. Do not number text heads-the template will do that for you.</w:t>
+        <w:rPr>
+          <w:lang w:val="en-US"/>
+        </w:rPr>
+      </w:pPr>
+      <w:r>
+        <w:rPr>
+          <w:lang w:val="en-US"/>
+        </w:rPr>
+        <w:t xml:space="preserve">This paper makes four contributions. First, a complete open simulation pipeline that streams real G-PCC bitstreams (six-tier ladder, four 8i </w:t>
+      </w:r>
+      <w:proofErr w:type="spellStart"/>
+      <w:r>
+        <w:rPr>
+          <w:lang w:val="en-US"/>
+        </w:rPr>
+        <w:t>Voxelized</w:t>
+      </w:r>
+      <w:proofErr w:type="spellEnd"/>
+      <w:r>
+        <w:rPr>
+          <w:lang w:val="en-US"/>
+        </w:rPr>
+        <w:t xml:space="preserve"> Full Bodies sequences [2]) over a trace-driven 5G channel with a TCP model whose serialization time is the exact integral of the measured time-varying capacity. Second, a quantitative analysis of segment size: per-frame fetching is round-trip-time (RTT) bound, and the measured </w:t>
+      </w:r>
+      <w:proofErr w:type="spellStart"/>
+      <w:r>
+        <w:rPr>
+          <w:lang w:val="en-US"/>
+        </w:rPr>
+        <w:t>QoE</w:t>
+      </w:r>
+      <w:proofErr w:type="spellEnd"/>
+      <w:r>
+        <w:rPr>
+          <w:lang w:val="en-US"/>
+        </w:rPr>
+        <w:t xml:space="preserve"> peaks at ten frames per request before larger segments react too slowly to fades. Third, a Double Deep Q-Network (DQN) [10] ABR agent trained on a quality-aware reward whose discounted return is, by construction, identical to the reported </w:t>
+      </w:r>
+      <w:proofErr w:type="spellStart"/>
+      <w:r>
+        <w:rPr>
+          <w:lang w:val="en-US"/>
+        </w:rPr>
+        <w:t>QoE</w:t>
+      </w:r>
+      <w:proofErr w:type="spellEnd"/>
+      <w:r>
+        <w:rPr>
+          <w:lang w:val="en-US"/>
+        </w:rPr>
+        <w:t xml:space="preserve"> metric. Fourth, a robust 12-seed evaluation on a registered, once-only test split in which the learned policy beats a buffer-based controller and an MPC controller by about 9 percent </w:t>
+      </w:r>
+      <w:proofErr w:type="spellStart"/>
+      <w:r>
+        <w:rPr>
+          <w:lang w:val="en-US"/>
+        </w:rPr>
+        <w:t>QoE</w:t>
+      </w:r>
+      <w:proofErr w:type="spellEnd"/>
+      <w:r>
+        <w:rPr>
+          <w:lang w:val="en-US"/>
+        </w:rPr>
+        <w:t xml:space="preserve"> and the best fixed arm by 59 percent, with a 12-seed standard deviation below 1 and an 83 percent per-scenario win rate against MPC.</w:t>
+      </w:r>
+    </w:p>
+    <w:p>
+      <w:pPr>
+        <w:pStyle w:val="Heading1"/>
+      </w:pPr>
+      <w:r>
+        <w:t>Related Work</w:t>
       </w:r>
     </w:p>
     <w:p>
@@ -830,10 +598,7 @@
         <w:pStyle w:val="Heading2"/>
       </w:pPr>
       <w:r>
-        <w:t>Abbreviations</w:t>
-      </w:r>
-      <w:r>
-        <w:t xml:space="preserve"> and Acronyms</w:t>
+        <w:t>Point cloud compression and streaming</w:t>
       </w:r>
     </w:p>
     <w:p>
@@ -841,15 +606,19 @@
         <w:pStyle w:val="BodyText"/>
       </w:pPr>
       <w:r>
-        <w:t xml:space="preserve">Define abbreviations and acronyms the first time they are used in the text, even after they have been defined in the abstract. Abbreviations such as IEEE, SI, MKS, CGS, </w:t>
+        <w:t xml:space="preserve">MPEG standardized two point cloud codecs: V-PCC, which projects the cloud onto video planes, and G-PCC, which codes geometry directly with octrees and attributes with hierarchical transforms [4], [5]. G-PCC exposes rate control through the geometry position quantization scale and the attribute quantization parameter (QP); it has no target-bitrate mode, so a bitrate ladder must be built from parameter pairs. DASH-PC [3] pioneered manifest-driven adaptive point cloud streaming with density sub-sampling. Van der Hooft et al. proposed PCC-DASH [8], rate-adapting V-PCC streams with heuristic policies. More recent volumetric streaming systems have begun to adopt learned adaptation [13], [14], though typically for V-PCC or mesh-based content and often with viewport or field-of-view assumptions. Our work differs by using standard G-PCC bitstreams, by replacing heuristic </w:t>
+      </w:r>
+      <w:r>
+        <w:lastRenderedPageBreak/>
+        <w:t xml:space="preserve">adaptation with a learned policy, and by making the training reward identical to the reported </w:t>
       </w:r>
       <w:proofErr w:type="spellStart"/>
       <w:r>
-        <w:t>sc</w:t>
+        <w:t>QoE</w:t>
       </w:r>
       <w:proofErr w:type="spellEnd"/>
       <w:r>
-        <w:t>, dc, and rms do not have to be defined. Do not use abbreviations in the title or heads unless they are unavoidable.</w:t>
+        <w:t>.</w:t>
       </w:r>
     </w:p>
     <w:p>
@@ -857,121 +626,101 @@
         <w:pStyle w:val="Heading2"/>
       </w:pPr>
       <w:r>
-        <w:t>Units</w:t>
-      </w:r>
-    </w:p>
-    <w:p>
-      <w:pPr>
-        <w:pStyle w:val="bulletlist"/>
-      </w:pPr>
-      <w:r>
-        <w:t xml:space="preserve">Use </w:t>
-      </w:r>
-      <w:r>
-        <w:t>either</w:t>
-      </w:r>
-      <w:r>
-        <w:t xml:space="preserve"> SI (MKS) or CGS as primary units. (SI units are encouraged.) English units may be used as secondary units (in parentheses). An exception would be the use of English units as identifiers in trade, such as “3.5-inch disk drive”.</w:t>
-      </w:r>
-    </w:p>
-    <w:p>
-      <w:pPr>
-        <w:pStyle w:val="bulletlist"/>
-      </w:pPr>
-      <w:r>
-        <w:t xml:space="preserve">Avoid combining SI and CGS units, such as current in amperes and magnetic field in </w:t>
+        <w:t>Learning-based bitrate adaptation</w:t>
+      </w:r>
+    </w:p>
+    <w:p>
+      <w:pPr>
+        <w:pStyle w:val="BodyText"/>
+      </w:pPr>
+      <w:r>
+        <w:t xml:space="preserve">Rule-based ABR uses throughput estimates [7] or buffer occupancy; </w:t>
       </w:r>
       <w:proofErr w:type="spellStart"/>
       <w:r>
-        <w:t>oersteds</w:t>
+        <w:t>Pensieve</w:t>
       </w:r>
       <w:proofErr w:type="spellEnd"/>
       <w:r>
-        <w:t>. This often leads to confusion because equations do not balance dimensionally. If you must use mixed units, clearly state the units for each quantity that you use in an equation.</w:t>
-      </w:r>
-    </w:p>
-    <w:p>
-      <w:pPr>
-        <w:pStyle w:val="bulletlist"/>
-      </w:pPr>
-      <w:r>
-        <w:t>Do not mix complete spellings and abbreviations of units: “Wb/m2” or “</w:t>
+        <w:t xml:space="preserve"> [6] showed that an RL policy trained in simulation generalizes across network conditions and outperforms such rules for 2D video. Its reward, quality minus rebuffering and quality switching, has become standard, and recent surveys track the rapid extension of learning-based adaptation to sustainable, energy-aware, and volumetric settings [15]. We adopt this structure, distinguish rebuffering duration from event frequency, replace the quality term with a log-bitrate utility suited to the two-orders-of-magnitude G-PCC ladder, and add a startup-delay cost. We compare the learned policy against two strong causal baselines used across the ABR literature: a buffer-occupancy controller in the style of BBA [12] and a short-horizon MPC controller in the style of </w:t>
       </w:r>
       <w:proofErr w:type="spellStart"/>
       <w:r>
-        <w:t>webers</w:t>
+        <w:t>RobustMPC</w:t>
       </w:r>
       <w:proofErr w:type="spellEnd"/>
       <w:r>
-        <w:t xml:space="preserve"> per square meter”, not “</w:t>
+        <w:t xml:space="preserve"> [7].</w:t>
+      </w:r>
+    </w:p>
+    <w:p>
+      <w:pPr>
+        <w:pStyle w:val="Heading2"/>
+      </w:pPr>
+      <w:r>
+        <w:t>5G measurement datasets</w:t>
+      </w:r>
+    </w:p>
+    <w:p>
+      <w:pPr>
+        <w:ind w:firstLine="14.40pt"/>
+        <w:jc w:val="both"/>
+      </w:pPr>
+      <w:r>
+        <w:t xml:space="preserve">Raca et al. published a 5G dataset with throughput, latency, and context metrics collected on a commercial Irish network [9]. We use its saturated-download traces as the access-link capacity signal and its measured ping (median 72 </w:t>
       </w:r>
       <w:proofErr w:type="spellStart"/>
       <w:r>
-        <w:t>webers</w:t>
+        <w:t>ms</w:t>
       </w:r>
       <w:proofErr w:type="spellEnd"/>
       <w:r>
-        <w:t xml:space="preserve">/m2”.  Spell out units when they appear in text: “. . . a few </w:t>
+        <w:t xml:space="preserve"> in 5G mode) as the RTT, rather than assuming idealized values.</w:t>
+      </w:r>
+    </w:p>
+    <w:p>
+      <w:pPr>
+        <w:jc w:val="both"/>
+      </w:pPr>
+    </w:p>
+    <w:p>
+      <w:pPr>
+        <w:pStyle w:val="Heading1"/>
+      </w:pPr>
+      <w:r>
+        <w:t>System Model</w:t>
+      </w:r>
+    </w:p>
+    <w:p>
+      <w:pPr>
+        <w:pStyle w:val="Heading2"/>
+      </w:pPr>
+      <w:r>
+        <w:t>Architecture</w:t>
+      </w:r>
+    </w:p>
+    <w:p>
+      <w:pPr>
+        <w:pStyle w:val="BodyText"/>
+      </w:pPr>
+      <w:r>
+        <w:t>Fig. 1 shows the system. Four 8iVFBv2 sequences (</w:t>
       </w:r>
       <w:proofErr w:type="spellStart"/>
       <w:r>
-        <w:t>henries</w:t>
+        <w:t>longdress</w:t>
       </w:r>
       <w:proofErr w:type="spellEnd"/>
       <w:r>
-        <w:t>”, not “. . . a few H”.</w:t>
-      </w:r>
-    </w:p>
-    <w:p>
-      <w:pPr>
-        <w:pStyle w:val="sponsors"/>
-        <w:framePr w:wrap="auto" w:vAnchor="page" w:hAnchor="page" w:x="45.90pt" w:y="756.05pt"/>
-        <w:ind w:firstLine="14.45pt"/>
-      </w:pPr>
-      <w:r>
-        <w:t>Identif</w:t>
-      </w:r>
-      <w:r>
-        <w:t xml:space="preserve">y applicable </w:t>
-      </w:r>
-      <w:r>
-        <w:t>funding agency</w:t>
-      </w:r>
-      <w:r>
-        <w:t xml:space="preserve"> here. </w:t>
-      </w:r>
-      <w:r>
-        <w:rPr>
-          <w:iCs/>
-        </w:rPr>
-        <w:t>If none, delete this text box</w:t>
-      </w:r>
-      <w:r>
-        <w:rPr>
-          <w:iCs/>
-        </w:rPr>
-        <w:t>.</w:t>
-      </w:r>
-    </w:p>
-    <w:p>
-      <w:pPr>
-        <w:pStyle w:val="bulletlist"/>
-      </w:pPr>
-      <w:r>
-        <w:t xml:space="preserve">Use a zero before decimal points: “0.25”, not “.25”. Use “cm3”, not “cc”. </w:t>
-      </w:r>
-      <w:r>
-        <w:t>(</w:t>
-      </w:r>
-      <w:r>
-        <w:rPr>
-          <w:i/>
-          <w:iCs/>
-        </w:rPr>
-        <w:t>bullet list</w:t>
-      </w:r>
-      <w:r>
-        <w:t>)</w:t>
+        <w:t xml:space="preserve">, loot, </w:t>
+      </w:r>
+      <w:proofErr w:type="spellStart"/>
+      <w:r>
+        <w:t>redandblack</w:t>
+      </w:r>
+      <w:proofErr w:type="spellEnd"/>
+      <w:r>
+        <w:t>, soldier; 300 frames, 30 fps) are encoded offline by the G-PCC reference encoder (TMC13) into six representations and stored on a content server together with a DASH-style media presentation description (MPD). An edge node fetches segments from the server across an unconstrained backhaul and serves the client over the bottleneck 5G access link. The client runs the ABR controller: it observes only its playback buffer and the achieved throughput of completed downloads (never the true link capacity) and requests one segment of S consecutive frames per decision.</w:t>
       </w:r>
     </w:p>
     <w:p>
@@ -979,37 +728,1925 @@
         <w:pStyle w:val="Heading2"/>
       </w:pPr>
       <w:r>
-        <w:t>Equations</w:t>
+        <w:t>Content and quality ladder</w:t>
+      </w:r>
+    </w:p>
+    <w:p>
+      <w:pPr>
+        <w:ind w:firstLine="14.40pt"/>
+        <w:jc w:val="both"/>
+        <w:rPr>
+          <w:spacing w:val="-1"/>
+          <w:lang w:val="x-none" w:eastAsia="x-none"/>
+        </w:rPr>
+      </w:pPr>
+      <w:r>
+        <w:rPr>
+          <w:spacing w:val="-1"/>
+          <w:lang w:val="x-none" w:eastAsia="x-none"/>
+        </w:rPr>
+        <w:t>Table I lists the ladder. Geometry follows the MPEG common test condition rate points (position quantization scale 1.0 down to 0.125) paired with attribute QP 22 to 51. The simulator transfers the exact coded size of every frame, so all results reflect real G-PCC rate characteristics.</w:t>
+      </w:r>
+    </w:p>
+    <w:p>
+      <w:pPr>
+        <w:ind w:firstLine="14.40pt"/>
+        <w:jc w:val="both"/>
+        <w:rPr>
+          <w:spacing w:val="-1"/>
+          <w:lang w:eastAsia="x-none"/>
+        </w:rPr>
+      </w:pPr>
+      <w:r>
+        <w:rPr>
+          <w:spacing w:val="-1"/>
+          <w:lang w:eastAsia="x-none"/>
+        </w:rPr>
+        <w:t>Perceived quality is modeled as a normalized log-bitrate utility, reflecting the diminishing perceptual return of higher rate points on a ladder that spans two orders of magnitude:</w:t>
+      </w:r>
+    </w:p>
+    <w:p>
+      <w:pPr>
+        <w:jc w:val="both"/>
+        <w:rPr>
+          <w:spacing w:val="-1"/>
+          <w:lang w:eastAsia="x-none"/>
+        </w:rPr>
+      </w:pPr>
+    </w:p>
+    <w:p>
+      <w:pPr>
+        <w:jc w:val="both"/>
+        <w:rPr>
+          <w:spacing w:val="-1"/>
+          <w:lang w:eastAsia="x-none"/>
+        </w:rPr>
+      </w:pPr>
+      <m:oMathPara>
+        <m:oMath>
+          <m:r>
+            <w:rPr>
+              <w:rFonts w:ascii="Cambria Math" w:hAnsi="Cambria Math"/>
+              <w:spacing w:val="-1"/>
+              <w:lang w:eastAsia="x-none"/>
+            </w:rPr>
+            <m:t xml:space="preserve">                       Q</m:t>
+          </m:r>
+          <m:d>
+            <m:dPr>
+              <m:ctrlPr>
+                <w:rPr>
+                  <w:rFonts w:ascii="Cambria Math" w:hAnsi="Cambria Math"/>
+                  <w:i/>
+                  <w:spacing w:val="-1"/>
+                  <w:lang w:eastAsia="x-none"/>
+                </w:rPr>
+              </m:ctrlPr>
+            </m:dPr>
+            <m:e>
+              <m:r>
+                <w:rPr>
+                  <w:rFonts w:ascii="Cambria Math" w:hAnsi="Cambria Math"/>
+                  <w:spacing w:val="-1"/>
+                  <w:lang w:eastAsia="x-none"/>
+                </w:rPr>
+                <m:t>r</m:t>
+              </m:r>
+            </m:e>
+          </m:d>
+          <m:r>
+            <w:rPr>
+              <w:rFonts w:ascii="Cambria Math" w:hAnsi="Cambria Math"/>
+              <w:spacing w:val="-1"/>
+              <w:lang w:eastAsia="x-none"/>
+            </w:rPr>
+            <m:t>=</m:t>
+          </m:r>
+          <m:f>
+            <m:fPr>
+              <m:ctrlPr>
+                <w:rPr>
+                  <w:rFonts w:ascii="Cambria Math" w:hAnsi="Cambria Math"/>
+                  <w:i/>
+                  <w:spacing w:val="-1"/>
+                  <w:lang w:eastAsia="x-none"/>
+                </w:rPr>
+              </m:ctrlPr>
+            </m:fPr>
+            <m:num>
+              <m:d>
+                <m:dPr>
+                  <m:begChr m:val="["/>
+                  <m:endChr m:val="]"/>
+                  <m:ctrlPr>
+                    <w:rPr>
+                      <w:rFonts w:ascii="Cambria Math" w:hAnsi="Cambria Math"/>
+                      <w:i/>
+                      <w:spacing w:val="-1"/>
+                      <w:lang w:eastAsia="x-none"/>
+                    </w:rPr>
+                  </m:ctrlPr>
+                </m:dPr>
+                <m:e>
+                  <m:func>
+                    <m:funcPr>
+                      <m:ctrlPr>
+                        <w:rPr>
+                          <w:rFonts w:ascii="Cambria Math" w:hAnsi="Cambria Math"/>
+                          <w:i/>
+                          <w:spacing w:val="-1"/>
+                          <w:lang w:eastAsia="x-none"/>
+                        </w:rPr>
+                      </m:ctrlPr>
+                    </m:funcPr>
+                    <m:fName>
+                      <m:r>
+                        <m:rPr>
+                          <m:sty m:val="p"/>
+                        </m:rPr>
+                        <w:rPr>
+                          <w:rFonts w:ascii="Cambria Math" w:hAnsi="Cambria Math"/>
+                          <w:spacing w:val="-1"/>
+                          <w:lang w:eastAsia="x-none"/>
+                        </w:rPr>
+                        <m:t>log</m:t>
+                      </m:r>
+                    </m:fName>
+                    <m:e>
+                      <m:r>
+                        <w:rPr>
+                          <w:rFonts w:ascii="Cambria Math" w:hAnsi="Cambria Math"/>
+                          <w:spacing w:val="-1"/>
+                          <w:lang w:eastAsia="x-none"/>
+                        </w:rPr>
+                        <m:t>B</m:t>
+                      </m:r>
+                      <m:d>
+                        <m:dPr>
+                          <m:ctrlPr>
+                            <w:rPr>
+                              <w:rFonts w:ascii="Cambria Math" w:hAnsi="Cambria Math"/>
+                              <w:i/>
+                              <w:spacing w:val="-1"/>
+                              <w:lang w:eastAsia="x-none"/>
+                            </w:rPr>
+                          </m:ctrlPr>
+                        </m:dPr>
+                        <m:e>
+                          <m:r>
+                            <w:rPr>
+                              <w:rFonts w:ascii="Cambria Math" w:hAnsi="Cambria Math"/>
+                              <w:spacing w:val="-1"/>
+                              <w:lang w:eastAsia="x-none"/>
+                            </w:rPr>
+                            <m:t>r</m:t>
+                          </m:r>
+                        </m:e>
+                      </m:d>
+                      <m:r>
+                        <w:rPr>
+                          <w:rFonts w:ascii="Cambria Math" w:hAnsi="Cambria Math"/>
+                          <w:spacing w:val="-1"/>
+                          <w:lang w:eastAsia="x-none"/>
+                        </w:rPr>
+                        <m:t>-</m:t>
+                      </m:r>
+                      <m:func>
+                        <m:funcPr>
+                          <m:ctrlPr>
+                            <w:rPr>
+                              <w:rFonts w:ascii="Cambria Math" w:hAnsi="Cambria Math"/>
+                              <w:spacing w:val="-1"/>
+                              <w:lang w:eastAsia="x-none"/>
+                            </w:rPr>
+                          </m:ctrlPr>
+                        </m:funcPr>
+                        <m:fName>
+                          <m:r>
+                            <m:rPr>
+                              <m:sty m:val="p"/>
+                            </m:rPr>
+                            <w:rPr>
+                              <w:rFonts w:ascii="Cambria Math" w:hAnsi="Cambria Math"/>
+                              <w:spacing w:val="-1"/>
+                              <w:lang w:eastAsia="x-none"/>
+                            </w:rPr>
+                            <m:t>log</m:t>
+                          </m:r>
+                        </m:fName>
+                        <m:e>
+                          <m:sSub>
+                            <m:sSubPr>
+                              <m:ctrlPr>
+                                <w:rPr>
+                                  <w:rFonts w:ascii="Cambria Math" w:hAnsi="Cambria Math"/>
+                                  <w:i/>
+                                  <w:spacing w:val="-1"/>
+                                  <w:lang w:eastAsia="x-none"/>
+                                </w:rPr>
+                              </m:ctrlPr>
+                            </m:sSubPr>
+                            <m:e>
+                              <m:r>
+                                <w:rPr>
+                                  <w:rFonts w:ascii="Cambria Math" w:hAnsi="Cambria Math"/>
+                                  <w:spacing w:val="-1"/>
+                                  <w:lang w:eastAsia="x-none"/>
+                                </w:rPr>
+                                <m:t>B</m:t>
+                              </m:r>
+                            </m:e>
+                            <m:sub>
+                              <m:r>
+                                <w:rPr>
+                                  <w:rFonts w:ascii="Cambria Math" w:hAnsi="Cambria Math"/>
+                                  <w:spacing w:val="-1"/>
+                                  <w:lang w:eastAsia="x-none"/>
+                                </w:rPr>
+                                <m:t>min</m:t>
+                              </m:r>
+                            </m:sub>
+                          </m:sSub>
+                        </m:e>
+                      </m:func>
+                    </m:e>
+                  </m:func>
+                </m:e>
+              </m:d>
+            </m:num>
+            <m:den>
+              <m:d>
+                <m:dPr>
+                  <m:begChr m:val="["/>
+                  <m:endChr m:val="]"/>
+                  <m:ctrlPr>
+                    <w:rPr>
+                      <w:rFonts w:ascii="Cambria Math" w:hAnsi="Cambria Math"/>
+                      <w:i/>
+                      <w:spacing w:val="-1"/>
+                      <w:lang w:eastAsia="x-none"/>
+                    </w:rPr>
+                  </m:ctrlPr>
+                </m:dPr>
+                <m:e>
+                  <m:func>
+                    <m:funcPr>
+                      <m:ctrlPr>
+                        <w:rPr>
+                          <w:rFonts w:ascii="Cambria Math" w:hAnsi="Cambria Math"/>
+                          <w:spacing w:val="-1"/>
+                          <w:lang w:eastAsia="x-none"/>
+                        </w:rPr>
+                      </m:ctrlPr>
+                    </m:funcPr>
+                    <m:fName>
+                      <m:r>
+                        <m:rPr>
+                          <m:sty m:val="p"/>
+                        </m:rPr>
+                        <w:rPr>
+                          <w:rFonts w:ascii="Cambria Math" w:hAnsi="Cambria Math"/>
+                          <w:spacing w:val="-1"/>
+                          <w:lang w:eastAsia="x-none"/>
+                        </w:rPr>
+                        <m:t>log</m:t>
+                      </m:r>
+                    </m:fName>
+                    <m:e>
+                      <m:sSub>
+                        <m:sSubPr>
+                          <m:ctrlPr>
+                            <w:rPr>
+                              <w:rFonts w:ascii="Cambria Math" w:hAnsi="Cambria Math"/>
+                              <w:i/>
+                              <w:spacing w:val="-1"/>
+                              <w:lang w:eastAsia="x-none"/>
+                            </w:rPr>
+                          </m:ctrlPr>
+                        </m:sSubPr>
+                        <m:e>
+                          <m:r>
+                            <w:rPr>
+                              <w:rFonts w:ascii="Cambria Math" w:hAnsi="Cambria Math"/>
+                              <w:spacing w:val="-1"/>
+                              <w:lang w:eastAsia="x-none"/>
+                            </w:rPr>
+                            <m:t>B</m:t>
+                          </m:r>
+                        </m:e>
+                        <m:sub>
+                          <m:r>
+                            <w:rPr>
+                              <w:rFonts w:ascii="Cambria Math" w:hAnsi="Cambria Math"/>
+                              <w:spacing w:val="-1"/>
+                              <w:lang w:eastAsia="x-none"/>
+                            </w:rPr>
+                            <m:t>max</m:t>
+                          </m:r>
+                        </m:sub>
+                      </m:sSub>
+                    </m:e>
+                  </m:func>
+                  <m:r>
+                    <w:rPr>
+                      <w:rFonts w:ascii="Cambria Math" w:hAnsi="Cambria Math"/>
+                      <w:spacing w:val="-1"/>
+                      <w:lang w:eastAsia="x-none"/>
+                    </w:rPr>
+                    <m:t>-</m:t>
+                  </m:r>
+                  <m:func>
+                    <m:funcPr>
+                      <m:ctrlPr>
+                        <w:rPr>
+                          <w:rFonts w:ascii="Cambria Math" w:hAnsi="Cambria Math"/>
+                          <w:i/>
+                          <w:spacing w:val="-1"/>
+                          <w:lang w:eastAsia="x-none"/>
+                        </w:rPr>
+                      </m:ctrlPr>
+                    </m:funcPr>
+                    <m:fName>
+                      <m:r>
+                        <m:rPr>
+                          <m:sty m:val="p"/>
+                        </m:rPr>
+                        <w:rPr>
+                          <w:rFonts w:ascii="Cambria Math" w:hAnsi="Cambria Math"/>
+                          <w:spacing w:val="-1"/>
+                          <w:lang w:eastAsia="x-none"/>
+                        </w:rPr>
+                        <m:t>log</m:t>
+                      </m:r>
+                    </m:fName>
+                    <m:e>
+                      <m:sSub>
+                        <m:sSubPr>
+                          <m:ctrlPr>
+                            <w:rPr>
+                              <w:rFonts w:ascii="Cambria Math" w:hAnsi="Cambria Math"/>
+                              <w:i/>
+                              <w:spacing w:val="-1"/>
+                              <w:lang w:eastAsia="x-none"/>
+                            </w:rPr>
+                          </m:ctrlPr>
+                        </m:sSubPr>
+                        <m:e>
+                          <m:r>
+                            <w:rPr>
+                              <w:rFonts w:ascii="Cambria Math" w:hAnsi="Cambria Math"/>
+                              <w:spacing w:val="-1"/>
+                              <w:lang w:eastAsia="x-none"/>
+                            </w:rPr>
+                            <m:t>B</m:t>
+                          </m:r>
+                        </m:e>
+                        <m:sub>
+                          <m:r>
+                            <w:rPr>
+                              <w:rFonts w:ascii="Cambria Math" w:hAnsi="Cambria Math"/>
+                              <w:spacing w:val="-1"/>
+                              <w:lang w:eastAsia="x-none"/>
+                            </w:rPr>
+                            <m:t>min</m:t>
+                          </m:r>
+                        </m:sub>
+                      </m:sSub>
+                    </m:e>
+                  </m:func>
+                </m:e>
+              </m:d>
+            </m:den>
+          </m:f>
+          <m:r>
+            <w:rPr>
+              <w:rFonts w:ascii="Cambria Math" w:hAnsi="Cambria Math"/>
+              <w:spacing w:val="-1"/>
+              <w:lang w:eastAsia="x-none"/>
+            </w:rPr>
+            <m:t xml:space="preserve">                     (1)</m:t>
+          </m:r>
+        </m:oMath>
+      </m:oMathPara>
+    </w:p>
+    <w:p>
+      <w:pPr>
+        <w:jc w:val="both"/>
+        <w:rPr>
+          <w:spacing w:val="-1"/>
+          <w:lang w:val="x-none" w:eastAsia="x-none"/>
+        </w:rPr>
+      </w:pPr>
+    </w:p>
+    <w:p>
+      <w:pPr>
+        <w:jc w:val="both"/>
+        <w:rPr>
+          <w:spacing w:val="-1"/>
+          <w:lang w:val="x-none" w:eastAsia="x-none"/>
+        </w:rPr>
+      </w:pPr>
+      <w:r>
+        <w:rPr>
+          <w:spacing w:val="-1"/>
+          <w:lang w:val="x-none" w:eastAsia="x-none"/>
+        </w:rPr>
+        <w:t xml:space="preserve">where </w:t>
+      </w:r>
+      <w:r>
+        <w:rPr>
+          <w:spacing w:val="-1"/>
+          <w:lang w:val="x-none" w:eastAsia="x-none"/>
+        </w:rPr>
+        <w:t>B</w:t>
+      </w:r>
+      <w:r>
+        <w:rPr>
+          <w:spacing w:val="-1"/>
+          <w:lang w:val="x-none" w:eastAsia="x-none"/>
+        </w:rPr>
+        <w:t>(r) is the coded bitrate of representation r and</w:t>
+      </w:r>
+      <w:r>
+        <w:rPr>
+          <w:spacing w:val="-1"/>
+          <w:lang w:val="x-none" w:eastAsia="x-none"/>
+        </w:rPr>
+        <w:t xml:space="preserve"> </w:t>
+      </w:r>
+      <w:proofErr w:type="spellStart"/>
+      <w:r>
+        <w:rPr>
+          <w:spacing w:val="-1"/>
+          <w:lang w:eastAsia="x-none" w:bidi="fa-IR"/>
+        </w:rPr>
+        <w:t>B</w:t>
+      </w:r>
+      <w:r>
+        <w:rPr>
+          <w:spacing w:val="-1"/>
+          <w:vertAlign w:val="subscript"/>
+          <w:lang w:eastAsia="x-none" w:bidi="fa-IR"/>
+        </w:rPr>
+        <w:t>min</w:t>
+      </w:r>
+      <w:proofErr w:type="spellEnd"/>
+      <w:r>
+        <w:rPr>
+          <w:spacing w:val="-1"/>
+          <w:lang w:val="x-none" w:eastAsia="x-none"/>
+        </w:rPr>
+        <w:t xml:space="preserve">, </w:t>
+      </w:r>
+      <w:proofErr w:type="spellStart"/>
+      <w:r>
+        <w:rPr>
+          <w:spacing w:val="-1"/>
+          <w:lang w:val="x-none" w:eastAsia="x-none"/>
+        </w:rPr>
+        <w:t>B</w:t>
+      </w:r>
+      <w:r>
+        <w:rPr>
+          <w:spacing w:val="-1"/>
+          <w:vertAlign w:val="subscript"/>
+          <w:lang w:val="x-none" w:eastAsia="x-none"/>
+        </w:rPr>
+        <w:t>max</w:t>
+      </w:r>
+      <w:proofErr w:type="spellEnd"/>
+      <w:r>
+        <w:rPr>
+          <w:spacing w:val="-1"/>
+          <w:lang w:val="x-none" w:eastAsia="x-none"/>
+        </w:rPr>
+        <w:t xml:space="preserve"> are the ladder endpoints, so </w:t>
+      </w:r>
+      <w:r>
+        <w:rPr>
+          <w:spacing w:val="-1"/>
+          <w:lang w:val="x-none" w:eastAsia="x-none"/>
+        </w:rPr>
+        <w:t>Q</w:t>
+      </w:r>
+      <w:r>
+        <w:rPr>
+          <w:spacing w:val="-1"/>
+          <w:lang w:val="x-none" w:eastAsia="x-none"/>
+        </w:rPr>
+        <w:t xml:space="preserve"> ranges from 0 (r01) to 1 (r06). This content-independent tier utility (last column of Table I) is fixed across sequences, so the reward and the reported metric never depend on per-clip point counts.</w:t>
       </w:r>
     </w:p>
     <w:p>
       <w:pPr>
         <w:pStyle w:val="BodyText"/>
       </w:pPr>
-      <w:r>
-        <w:t>The equations are an exception to the prescribed specifications of this template. You will need to determine whether or not your equation should be typed using either the Times New Roman or the Symbol font (please no other font). To create multileveled equations, it may be necessary to treat the equation as a graphic and insert it into the text after your paper is styled.</w:t>
-      </w:r>
     </w:p>
     <w:p>
       <w:pPr>
         <w:pStyle w:val="BodyText"/>
+        <w:keepNext/>
+        <w:ind w:firstLine="0pt"/>
+      </w:pPr>
+      <w:r>
+        <w:rPr>
+          <w:noProof/>
+        </w:rPr>
+        <w:drawing>
+          <wp:inline distT="0" distB="0" distL="0" distR="0" wp14:anchorId="74ADACE2" wp14:editId="13511D3C">
+            <wp:extent cx="3089910" cy="1986280"/>
+            <wp:effectExtent l="0" t="0" r="0" b="0"/>
+            <wp:docPr id="1693122990" name="Graphic 3"/>
+            <wp:cNvGraphicFramePr>
+              <a:graphicFrameLocks xmlns:a="http://purl.oclc.org/ooxml/drawingml/main" noChangeAspect="1"/>
+            </wp:cNvGraphicFramePr>
+            <a:graphic xmlns:a="http://purl.oclc.org/ooxml/drawingml/main">
+              <a:graphicData uri="http://purl.oclc.org/ooxml/drawingml/picture">
+                <pic:pic xmlns:pic="http://purl.oclc.org/ooxml/drawingml/picture">
+                  <pic:nvPicPr>
+                    <pic:cNvPr id="1693122990" name="Graphic 1693122990"/>
+                    <pic:cNvPicPr/>
+                  </pic:nvPicPr>
+                  <pic:blipFill>
+                    <a:blip r:embed="rId9">
+                      <a:extLst>
+                        <a:ext uri="{96DAC541-7B7A-43D3-8B79-37D633B846F1}">
+                          <asvg:svgBlip xmlns:asvg="http://schemas.microsoft.com/office/drawing/2016/SVG/main" r:embed="rId10"/>
+                        </a:ext>
+                      </a:extLst>
+                    </a:blip>
+                    <a:stretch>
+                      <a:fillRect/>
+                    </a:stretch>
+                  </pic:blipFill>
+                  <pic:spPr>
+                    <a:xfrm>
+                      <a:off x="0" y="0"/>
+                      <a:ext cx="3089910" cy="1986280"/>
+                    </a:xfrm>
+                    <a:prstGeom prst="rect">
+                      <a:avLst/>
+                    </a:prstGeom>
+                  </pic:spPr>
+                </pic:pic>
+              </a:graphicData>
+            </a:graphic>
+          </wp:inline>
+        </w:drawing>
+      </w:r>
+    </w:p>
+    <w:p>
+      <w:pPr>
+        <w:pStyle w:val="Caption"/>
+        <w:jc w:val="both"/>
+        <w:rPr>
+          <w:i w:val="0"/>
+          <w:iCs w:val="0"/>
+          <w:color w:val="auto"/>
+          <w:sz w:val="16"/>
+          <w:szCs w:val="16"/>
+        </w:rPr>
+      </w:pPr>
+      <w:r>
+        <w:rPr>
+          <w:i w:val="0"/>
+          <w:iCs w:val="0"/>
+          <w:color w:val="auto"/>
+          <w:sz w:val="16"/>
+          <w:szCs w:val="16"/>
+        </w:rPr>
+        <w:t xml:space="preserve">Fig. </w:t>
+      </w:r>
+      <w:r>
+        <w:rPr>
+          <w:i w:val="0"/>
+          <w:iCs w:val="0"/>
+          <w:color w:val="auto"/>
+          <w:sz w:val="16"/>
+          <w:szCs w:val="16"/>
+        </w:rPr>
+        <w:fldChar w:fldCharType="begin"/>
+      </w:r>
+      <w:r>
+        <w:rPr>
+          <w:i w:val="0"/>
+          <w:iCs w:val="0"/>
+          <w:color w:val="auto"/>
+          <w:sz w:val="16"/>
+          <w:szCs w:val="16"/>
+        </w:rPr>
+        <w:instrText xml:space="preserve"> SEQ Figure \* ARABIC </w:instrText>
+      </w:r>
+      <w:r>
+        <w:rPr>
+          <w:i w:val="0"/>
+          <w:iCs w:val="0"/>
+          <w:color w:val="auto"/>
+          <w:sz w:val="16"/>
+          <w:szCs w:val="16"/>
+        </w:rPr>
+        <w:fldChar w:fldCharType="separate"/>
+      </w:r>
+      <w:r>
+        <w:rPr>
+          <w:i w:val="0"/>
+          <w:iCs w:val="0"/>
+          <w:noProof/>
+          <w:color w:val="auto"/>
+          <w:sz w:val="16"/>
+          <w:szCs w:val="16"/>
+        </w:rPr>
+        <w:t>1</w:t>
+      </w:r>
+      <w:r>
+        <w:rPr>
+          <w:i w:val="0"/>
+          <w:iCs w:val="0"/>
+          <w:color w:val="auto"/>
+          <w:sz w:val="16"/>
+          <w:szCs w:val="16"/>
+        </w:rPr>
+        <w:fldChar w:fldCharType="end"/>
+      </w:r>
+      <w:r>
+        <w:rPr>
+          <w:i w:val="0"/>
+          <w:iCs w:val="0"/>
+          <w:color w:val="auto"/>
+          <w:sz w:val="16"/>
+          <w:szCs w:val="16"/>
+        </w:rPr>
+        <w:t>. System architecture: G-PCC encoding, content server, unconstrained backhaul, edge node, and the 5G access link to the DQN-driven point cloud client.</w:t>
+      </w:r>
+    </w:p>
+    <w:p>
+      <w:pPr>
+        <w:pStyle w:val="Heading2"/>
+      </w:pPr>
+      <w:r>
+        <w:t>Network and transport model</w:t>
+      </w:r>
+    </w:p>
+    <w:p>
+      <w:pPr>
+        <w:ind w:firstLine="14.40pt"/>
+        <w:jc w:val="both"/>
+      </w:pPr>
+      <w:r>
+        <w:t xml:space="preserve">The access link is driven by 21 saturated-download traces of the Irish 5G dataset [9] (5 static, 16 driving), split by a registered protocol into 13 training, 4 validation, and 4 held-out test traces (the test split, sampled once with a fixed seed after removing the validation traces, contains three driving traces and one static trace). Model, reward, checkpoint, and baseline settings are frozen before the test split is ever evaluated. Every trace is cut into feasibility-checked windows on the measured timestamp grid, so no download crosses a coverage gap. A TCP connection with slow start, additive-increase multiplicative-decrease, and the dataset-derived 72 </w:t>
+      </w:r>
+      <w:proofErr w:type="spellStart"/>
+      <w:r>
+        <w:t>ms</w:t>
+      </w:r>
+      <w:proofErr w:type="spellEnd"/>
+      <w:r>
+        <w:t xml:space="preserve"> RTT carries every transfer. Capacity is re-</w:t>
+      </w:r>
+      <w:proofErr w:type="gramStart"/>
+      <w:r>
+        <w:t>queried</w:t>
+      </w:r>
+      <w:proofErr w:type="gramEnd"/>
+      <w:r>
+        <w:t xml:space="preserve"> every RTT round, and serialization time is computed as the exact integral of the piecewise-constant capacity, so a download traverses the trace instead of freezing a single sample. The client buffer holds 5 s, playback starts after 1 s has been buffered, and playback then runs at a fixed 30 fps; an empty buffer causes rebuffering. A request-pacing rule admits the next segment only when it fits the buffer—the client waits </w:t>
+      </w:r>
+      <w:proofErr w:type="spellStart"/>
+      <w:r>
+        <w:t>w</w:t>
+      </w:r>
+      <w:r>
+        <w:rPr>
+          <w:vertAlign w:val="subscript"/>
+        </w:rPr>
+        <w:t>t</w:t>
+      </w:r>
+      <w:proofErr w:type="spellEnd"/>
+      <w:r>
+        <w:t xml:space="preserve"> = </w:t>
+      </w:r>
+      <w:proofErr w:type="gramStart"/>
+      <w:r>
+        <w:t>max(</w:t>
+      </w:r>
+      <w:proofErr w:type="gramEnd"/>
+      <w:r>
+        <w:t xml:space="preserve">0, </w:t>
+      </w:r>
+      <w:proofErr w:type="spellStart"/>
+      <w:r>
+        <w:t>B</w:t>
+      </w:r>
+      <w:r>
+        <w:rPr>
+          <w:vertAlign w:val="subscript"/>
+        </w:rPr>
+        <w:t>t</w:t>
+      </w:r>
+      <w:proofErr w:type="spellEnd"/>
+      <w:r>
+        <w:t xml:space="preserve"> + S/f </w:t>
+      </w:r>
+      <w:r>
+        <w:t>–</w:t>
+      </w:r>
+      <w:r>
+        <w:t xml:space="preserve"> </w:t>
+      </w:r>
+      <w:proofErr w:type="spellStart"/>
+      <w:r>
+        <w:t>B</w:t>
+      </w:r>
+      <w:r>
+        <w:rPr>
+          <w:vertAlign w:val="subscript"/>
+        </w:rPr>
+        <w:t>max</w:t>
+      </w:r>
+      <w:proofErr w:type="spellEnd"/>
+      <w:r>
+        <w:t>) seconds when the buffer is nearly full—so buffer overflow never discards frames and the pacing wait is excluded from throughput measurements.</w:t>
+      </w:r>
+    </w:p>
+    <w:p>
+      <w:pPr>
+        <w:pStyle w:val="Heading2"/>
+      </w:pPr>
+      <w:r>
+        <w:t>Segment-based fetching</w:t>
+      </w:r>
+    </w:p>
+    <w:p>
+      <w:pPr>
+        <w:ind w:firstLine="14.40pt"/>
+        <w:jc w:val="both"/>
+        <w:rPr>
+          <w:spacing w:val="-1"/>
+          <w:lang w:val="x-none" w:eastAsia="x-none"/>
+        </w:rPr>
+      </w:pPr>
+      <w:r>
+        <w:rPr>
+          <w:spacing w:val="-1"/>
+          <w:lang w:val="x-none" w:eastAsia="x-none"/>
+        </w:rPr>
+        <w:t xml:space="preserve">Each ABR decision requests S consecutive frames as one HTTP transfer, amortizing the RTT. At S = 1 every 33 </w:t>
+      </w:r>
+      <w:proofErr w:type="spellStart"/>
+      <w:r>
+        <w:rPr>
+          <w:spacing w:val="-1"/>
+          <w:lang w:val="x-none" w:eastAsia="x-none"/>
+        </w:rPr>
+        <w:t>ms</w:t>
+      </w:r>
+      <w:proofErr w:type="spellEnd"/>
+      <w:r>
+        <w:rPr>
+          <w:spacing w:val="-1"/>
+          <w:lang w:val="x-none" w:eastAsia="x-none"/>
+        </w:rPr>
+        <w:t xml:space="preserve"> frame pays a 72 </w:t>
+      </w:r>
+      <w:proofErr w:type="spellStart"/>
+      <w:r>
+        <w:rPr>
+          <w:spacing w:val="-1"/>
+          <w:lang w:val="x-none" w:eastAsia="x-none"/>
+        </w:rPr>
+        <w:t>ms</w:t>
+      </w:r>
+      <w:proofErr w:type="spellEnd"/>
+      <w:r>
+        <w:rPr>
+          <w:spacing w:val="-1"/>
+          <w:lang w:val="x-none" w:eastAsia="x-none"/>
+        </w:rPr>
+        <w:t xml:space="preserve"> round trip, so no tier can sustain 30 fps; at large S the controller cannot react to mid-segment fades. Section V-C sweeps S over {5, 8, 10, 15}; </w:t>
+      </w:r>
+      <w:proofErr w:type="spellStart"/>
+      <w:r>
+        <w:rPr>
+          <w:spacing w:val="-1"/>
+          <w:lang w:val="x-none" w:eastAsia="x-none"/>
+        </w:rPr>
+        <w:t>QoE</w:t>
+      </w:r>
+      <w:proofErr w:type="spellEnd"/>
+      <w:r>
+        <w:rPr>
+          <w:spacing w:val="-1"/>
+          <w:lang w:val="x-none" w:eastAsia="x-none"/>
+        </w:rPr>
+        <w:t xml:space="preserve"> peaks at S = 10, which the final system adopts.</w:t>
+      </w:r>
+    </w:p>
+    <w:p>
+      <w:pPr>
+        <w:pStyle w:val="Heading1"/>
+      </w:pPr>
+      <w:r>
+        <w:t>DQN-Based Bitrate Adaptation</w:t>
+      </w:r>
+    </w:p>
+    <w:p>
+      <w:pPr>
+        <w:pStyle w:val="Heading2"/>
+      </w:pPr>
+      <w:r>
+        <w:t>State, action, and decision flow</w:t>
+      </w:r>
+    </w:p>
+    <w:p>
+      <w:pPr>
+        <w:ind w:firstLine="14.40pt"/>
+        <w:jc w:val="both"/>
+        <w:rPr>
+          <w:spacing w:val="-1"/>
+          <w:lang w:eastAsia="x-none"/>
+        </w:rPr>
+      </w:pPr>
+      <w:r>
+        <w:rPr>
+          <w:spacing w:val="-1"/>
+          <w:lang w:eastAsia="x-none"/>
+        </w:rPr>
+        <w:t>Fig. 2 shows the runtime decision flow. The 23-dimensional state contains an LSTM one-step bandwidth prediction (1), the buffer level (1), the previous tier as a one-hot vector (6), the last, mean, and standard deviation of the five most recent achieved-throughput samples (3), and the per-tier bitrates (6) and tier utilities (6) taken from the manifest. All features are normalized with constants stored in the model checkpoint, so training and inference can never diverge.</w:t>
+      </w:r>
+    </w:p>
+    <w:p>
+      <w:pPr>
+        <w:pStyle w:val="Caption"/>
+        <w:keepNext/>
+        <w:rPr>
+          <w:i w:val="0"/>
+          <w:iCs w:val="0"/>
+          <w:color w:val="auto"/>
+          <w:sz w:val="16"/>
+          <w:szCs w:val="16"/>
+        </w:rPr>
+      </w:pPr>
+      <w:r>
+        <w:rPr>
+          <w:i w:val="0"/>
+          <w:iCs w:val="0"/>
+          <w:color w:val="auto"/>
+          <w:sz w:val="16"/>
+          <w:szCs w:val="16"/>
+        </w:rPr>
+        <w:lastRenderedPageBreak/>
+        <w:t xml:space="preserve">Table </w:t>
+      </w:r>
+      <w:r>
+        <w:rPr>
+          <w:i w:val="0"/>
+          <w:iCs w:val="0"/>
+          <w:color w:val="auto"/>
+          <w:sz w:val="16"/>
+          <w:szCs w:val="16"/>
+        </w:rPr>
+        <w:fldChar w:fldCharType="begin"/>
+      </w:r>
+      <w:r>
+        <w:rPr>
+          <w:i w:val="0"/>
+          <w:iCs w:val="0"/>
+          <w:color w:val="auto"/>
+          <w:sz w:val="16"/>
+          <w:szCs w:val="16"/>
+        </w:rPr>
+        <w:instrText xml:space="preserve"> SEQ Table \* ROMAN </w:instrText>
+      </w:r>
+      <w:r>
+        <w:rPr>
+          <w:i w:val="0"/>
+          <w:iCs w:val="0"/>
+          <w:color w:val="auto"/>
+          <w:sz w:val="16"/>
+          <w:szCs w:val="16"/>
+        </w:rPr>
+        <w:fldChar w:fldCharType="separate"/>
+      </w:r>
+      <w:r>
+        <w:rPr>
+          <w:i w:val="0"/>
+          <w:iCs w:val="0"/>
+          <w:noProof/>
+          <w:color w:val="auto"/>
+          <w:sz w:val="16"/>
+          <w:szCs w:val="16"/>
+        </w:rPr>
+        <w:t>I</w:t>
+      </w:r>
+      <w:r>
+        <w:rPr>
+          <w:i w:val="0"/>
+          <w:iCs w:val="0"/>
+          <w:color w:val="auto"/>
+          <w:sz w:val="16"/>
+          <w:szCs w:val="16"/>
+        </w:rPr>
+        <w:fldChar w:fldCharType="end"/>
+      </w:r>
+      <w:r>
+        <w:rPr>
+          <w:i w:val="0"/>
+          <w:iCs w:val="0"/>
+          <w:noProof/>
+          <w:color w:val="auto"/>
+          <w:sz w:val="16"/>
+          <w:szCs w:val="16"/>
+        </w:rPr>
+        <w:t>. Six-Tier G-PCC Quality Ladder (Longdress)</w:t>
+      </w:r>
+    </w:p>
+    <w:tbl>
+      <w:tblPr>
+        <w:tblW w:w="243pt" w:type="dxa"/>
+        <w:jc w:val="center"/>
+        <w:tblBorders>
+          <w:top w:val="single" w:sz="2" w:space="0" w:color="auto"/>
+          <w:start w:val="single" w:sz="2" w:space="0" w:color="auto"/>
+          <w:bottom w:val="single" w:sz="2" w:space="0" w:color="auto"/>
+          <w:end w:val="single" w:sz="2" w:space="0" w:color="auto"/>
+          <w:insideH w:val="single" w:sz="2" w:space="0" w:color="auto"/>
+          <w:insideV w:val="single" w:sz="2" w:space="0" w:color="auto"/>
+        </w:tblBorders>
+        <w:tblLayout w:type="fixed"/>
+        <w:tblLook w:firstRow="0" w:lastRow="0" w:firstColumn="0" w:lastColumn="0" w:noHBand="0" w:noVBand="0"/>
+      </w:tblPr>
+      <w:tblGrid>
+        <w:gridCol w:w="564"/>
+        <w:gridCol w:w="851"/>
+        <w:gridCol w:w="850"/>
+        <w:gridCol w:w="851"/>
+        <w:gridCol w:w="992"/>
+        <w:gridCol w:w="752"/>
+      </w:tblGrid>
+      <w:tr>
+        <w:trPr>
+          <w:cantSplit/>
+          <w:trHeight w:val="485"/>
+          <w:tblHeader/>
+          <w:jc w:val="center"/>
+        </w:trPr>
+        <w:tc>
+          <w:tcPr>
+            <w:tcW w:w="28.20pt" w:type="dxa"/>
+            <w:vAlign w:val="center"/>
+          </w:tcPr>
+          <w:p>
+            <w:pPr>
+              <w:pStyle w:val="tablecolhead"/>
+            </w:pPr>
+            <w:r>
+              <w:t>Tier</w:t>
+            </w:r>
+          </w:p>
+        </w:tc>
+        <w:tc>
+          <w:tcPr>
+            <w:tcW w:w="42.55pt" w:type="dxa"/>
+            <w:vAlign w:val="center"/>
+          </w:tcPr>
+          <w:p>
+            <w:pPr>
+              <w:pStyle w:val="tablecolhead"/>
+            </w:pPr>
+            <w:proofErr w:type="spellStart"/>
+            <w:r>
+              <w:t>Pos.scale</w:t>
+            </w:r>
+            <w:proofErr w:type="spellEnd"/>
+          </w:p>
+        </w:tc>
+        <w:tc>
+          <w:tcPr>
+            <w:tcW w:w="42.50pt" w:type="dxa"/>
+            <w:vAlign w:val="center"/>
+          </w:tcPr>
+          <w:p>
+            <w:pPr>
+              <w:pStyle w:val="tablecolhead"/>
+            </w:pPr>
+            <w:proofErr w:type="spellStart"/>
+            <w:r>
+              <w:t>Attr.QP</w:t>
+            </w:r>
+            <w:proofErr w:type="spellEnd"/>
+          </w:p>
+        </w:tc>
+        <w:tc>
+          <w:tcPr>
+            <w:tcW w:w="42.55pt" w:type="dxa"/>
+            <w:vAlign w:val="center"/>
+          </w:tcPr>
+          <w:p>
+            <w:pPr>
+              <w:pStyle w:val="tablecolhead"/>
+            </w:pPr>
+            <w:r>
+              <w:t>Bitrate (Mbit/s)</w:t>
+            </w:r>
+          </w:p>
+        </w:tc>
+        <w:tc>
+          <w:tcPr>
+            <w:tcW w:w="49.60pt" w:type="dxa"/>
+            <w:vAlign w:val="center"/>
+          </w:tcPr>
+          <w:p>
+            <w:pPr>
+              <w:pStyle w:val="tablecolhead"/>
+            </w:pPr>
+            <w:r>
+              <w:t>Points (frame 0)</w:t>
+            </w:r>
+          </w:p>
+        </w:tc>
+        <w:tc>
+          <w:tcPr>
+            <w:tcW w:w="37.60pt" w:type="dxa"/>
+            <w:vAlign w:val="center"/>
+          </w:tcPr>
+          <w:p>
+            <w:pPr>
+              <w:pStyle w:val="tablecolhead"/>
+            </w:pPr>
+            <w:r>
+              <w:t xml:space="preserve">Utility </w:t>
+            </w:r>
+            <w:r>
+              <w:t>Q</w:t>
+            </w:r>
+          </w:p>
+        </w:tc>
+      </w:tr>
+      <w:tr>
+        <w:trPr>
+          <w:trHeight w:val="320"/>
+          <w:jc w:val="center"/>
+        </w:trPr>
+        <w:tc>
+          <w:tcPr>
+            <w:tcW w:w="28.20pt" w:type="dxa"/>
+            <w:vAlign w:val="center"/>
+          </w:tcPr>
+          <w:p>
+            <w:pPr>
+              <w:pStyle w:val="tablecopy"/>
+              <w:rPr>
+                <w:sz w:val="8"/>
+                <w:szCs w:val="8"/>
+              </w:rPr>
+            </w:pPr>
+            <w:r>
+              <w:t>R6</w:t>
+            </w:r>
+          </w:p>
+        </w:tc>
+        <w:tc>
+          <w:tcPr>
+            <w:tcW w:w="42.55pt" w:type="dxa"/>
+            <w:vAlign w:val="center"/>
+          </w:tcPr>
+          <w:p>
+            <w:pPr>
+              <w:rPr>
+                <w:sz w:val="16"/>
+                <w:szCs w:val="16"/>
+              </w:rPr>
+            </w:pPr>
+            <w:r>
+              <w:rPr>
+                <w:sz w:val="16"/>
+                <w:szCs w:val="16"/>
+              </w:rPr>
+              <w:t>1.000</w:t>
+            </w:r>
+          </w:p>
+        </w:tc>
+        <w:tc>
+          <w:tcPr>
+            <w:tcW w:w="42.50pt" w:type="dxa"/>
+            <w:vAlign w:val="center"/>
+          </w:tcPr>
+          <w:p>
+            <w:pPr>
+              <w:rPr>
+                <w:sz w:val="16"/>
+                <w:szCs w:val="16"/>
+              </w:rPr>
+            </w:pPr>
+            <w:r>
+              <w:rPr>
+                <w:sz w:val="16"/>
+                <w:szCs w:val="16"/>
+              </w:rPr>
+              <w:t>22</w:t>
+            </w:r>
+          </w:p>
+        </w:tc>
+        <w:tc>
+          <w:tcPr>
+            <w:tcW w:w="42.55pt" w:type="dxa"/>
+            <w:vAlign w:val="center"/>
+          </w:tcPr>
+          <w:p>
+            <w:pPr>
+              <w:rPr>
+                <w:sz w:val="16"/>
+                <w:szCs w:val="16"/>
+              </w:rPr>
+            </w:pPr>
+            <w:r>
+              <w:rPr>
+                <w:sz w:val="16"/>
+                <w:szCs w:val="16"/>
+              </w:rPr>
+              <w:t>102.4</w:t>
+            </w:r>
+          </w:p>
+        </w:tc>
+        <w:tc>
+          <w:tcPr>
+            <w:tcW w:w="49.60pt" w:type="dxa"/>
+            <w:vAlign w:val="center"/>
+          </w:tcPr>
+          <w:p>
+            <w:pPr>
+              <w:rPr>
+                <w:sz w:val="16"/>
+                <w:szCs w:val="16"/>
+              </w:rPr>
+            </w:pPr>
+            <w:r>
+              <w:rPr>
+                <w:sz w:val="16"/>
+                <w:szCs w:val="16"/>
+              </w:rPr>
+              <w:t>765,821</w:t>
+            </w:r>
+          </w:p>
+        </w:tc>
+        <w:tc>
+          <w:tcPr>
+            <w:tcW w:w="37.60pt" w:type="dxa"/>
+            <w:vAlign w:val="center"/>
+          </w:tcPr>
+          <w:p>
+            <w:pPr>
+              <w:rPr>
+                <w:sz w:val="16"/>
+                <w:szCs w:val="16"/>
+              </w:rPr>
+            </w:pPr>
+            <w:r>
+              <w:rPr>
+                <w:sz w:val="16"/>
+                <w:szCs w:val="16"/>
+              </w:rPr>
+              <w:t>1.000</w:t>
+            </w:r>
+          </w:p>
+        </w:tc>
+      </w:tr>
+      <w:tr>
+        <w:trPr>
+          <w:trHeight w:val="320"/>
+          <w:jc w:val="center"/>
+        </w:trPr>
+        <w:tc>
+          <w:tcPr>
+            <w:tcW w:w="28.20pt" w:type="dxa"/>
+            <w:vAlign w:val="center"/>
+          </w:tcPr>
+          <w:p>
+            <w:pPr>
+              <w:pStyle w:val="tablecopy"/>
+            </w:pPr>
+            <w:r>
+              <w:t>R5</w:t>
+            </w:r>
+          </w:p>
+        </w:tc>
+        <w:tc>
+          <w:tcPr>
+            <w:tcW w:w="42.55pt" w:type="dxa"/>
+            <w:vAlign w:val="center"/>
+          </w:tcPr>
+          <w:p>
+            <w:pPr>
+              <w:rPr>
+                <w:sz w:val="16"/>
+                <w:szCs w:val="16"/>
+              </w:rPr>
+            </w:pPr>
+            <w:r>
+              <w:rPr>
+                <w:sz w:val="16"/>
+                <w:szCs w:val="16"/>
+              </w:rPr>
+              <w:t>0.875</w:t>
+            </w:r>
+          </w:p>
+        </w:tc>
+        <w:tc>
+          <w:tcPr>
+            <w:tcW w:w="42.50pt" w:type="dxa"/>
+            <w:vAlign w:val="center"/>
+          </w:tcPr>
+          <w:p>
+            <w:pPr>
+              <w:rPr>
+                <w:sz w:val="16"/>
+                <w:szCs w:val="16"/>
+              </w:rPr>
+            </w:pPr>
+            <w:r>
+              <w:rPr>
+                <w:sz w:val="16"/>
+                <w:szCs w:val="16"/>
+              </w:rPr>
+              <w:t>28</w:t>
+            </w:r>
+          </w:p>
+        </w:tc>
+        <w:tc>
+          <w:tcPr>
+            <w:tcW w:w="42.55pt" w:type="dxa"/>
+            <w:vAlign w:val="center"/>
+          </w:tcPr>
+          <w:p>
+            <w:pPr>
+              <w:rPr>
+                <w:sz w:val="16"/>
+                <w:szCs w:val="16"/>
+              </w:rPr>
+            </w:pPr>
+            <w:r>
+              <w:rPr>
+                <w:sz w:val="16"/>
+                <w:szCs w:val="16"/>
+              </w:rPr>
+              <w:t>59.6</w:t>
+            </w:r>
+          </w:p>
+        </w:tc>
+        <w:tc>
+          <w:tcPr>
+            <w:tcW w:w="49.60pt" w:type="dxa"/>
+            <w:vAlign w:val="center"/>
+          </w:tcPr>
+          <w:p>
+            <w:pPr>
+              <w:rPr>
+                <w:sz w:val="16"/>
+                <w:szCs w:val="16"/>
+              </w:rPr>
+            </w:pPr>
+            <w:r>
+              <w:rPr>
+                <w:sz w:val="16"/>
+                <w:szCs w:val="16"/>
+              </w:rPr>
+              <w:t>602,139</w:t>
+            </w:r>
+          </w:p>
+        </w:tc>
+        <w:tc>
+          <w:tcPr>
+            <w:tcW w:w="37.60pt" w:type="dxa"/>
+            <w:vAlign w:val="center"/>
+          </w:tcPr>
+          <w:p>
+            <w:pPr>
+              <w:rPr>
+                <w:sz w:val="16"/>
+                <w:szCs w:val="16"/>
+              </w:rPr>
+            </w:pPr>
+            <w:r>
+              <w:rPr>
+                <w:sz w:val="16"/>
+                <w:szCs w:val="16"/>
+              </w:rPr>
+              <w:t>0.898</w:t>
+            </w:r>
+          </w:p>
+        </w:tc>
+      </w:tr>
+      <w:tr>
+        <w:trPr>
+          <w:trHeight w:val="320"/>
+          <w:jc w:val="center"/>
+        </w:trPr>
+        <w:tc>
+          <w:tcPr>
+            <w:tcW w:w="28.20pt" w:type="dxa"/>
+            <w:vAlign w:val="center"/>
+          </w:tcPr>
+          <w:p>
+            <w:pPr>
+              <w:pStyle w:val="tablecopy"/>
+            </w:pPr>
+            <w:r>
+              <w:t>R4</w:t>
+            </w:r>
+          </w:p>
+        </w:tc>
+        <w:tc>
+          <w:tcPr>
+            <w:tcW w:w="42.55pt" w:type="dxa"/>
+            <w:vAlign w:val="center"/>
+          </w:tcPr>
+          <w:p>
+            <w:pPr>
+              <w:rPr>
+                <w:sz w:val="16"/>
+                <w:szCs w:val="16"/>
+              </w:rPr>
+            </w:pPr>
+            <w:r>
+              <w:rPr>
+                <w:sz w:val="16"/>
+                <w:szCs w:val="16"/>
+              </w:rPr>
+              <w:t>0.750</w:t>
+            </w:r>
+          </w:p>
+        </w:tc>
+        <w:tc>
+          <w:tcPr>
+            <w:tcW w:w="42.50pt" w:type="dxa"/>
+            <w:vAlign w:val="center"/>
+          </w:tcPr>
+          <w:p>
+            <w:pPr>
+              <w:rPr>
+                <w:sz w:val="16"/>
+                <w:szCs w:val="16"/>
+              </w:rPr>
+            </w:pPr>
+            <w:r>
+              <w:rPr>
+                <w:sz w:val="16"/>
+                <w:szCs w:val="16"/>
+              </w:rPr>
+              <w:t>34</w:t>
+            </w:r>
+          </w:p>
+        </w:tc>
+        <w:tc>
+          <w:tcPr>
+            <w:tcW w:w="42.55pt" w:type="dxa"/>
+            <w:vAlign w:val="center"/>
+          </w:tcPr>
+          <w:p>
+            <w:pPr>
+              <w:rPr>
+                <w:sz w:val="16"/>
+                <w:szCs w:val="16"/>
+              </w:rPr>
+            </w:pPr>
+            <w:r>
+              <w:rPr>
+                <w:sz w:val="16"/>
+                <w:szCs w:val="16"/>
+              </w:rPr>
+              <w:t>35.5</w:t>
+            </w:r>
+          </w:p>
+        </w:tc>
+        <w:tc>
+          <w:tcPr>
+            <w:tcW w:w="49.60pt" w:type="dxa"/>
+            <w:vAlign w:val="center"/>
+          </w:tcPr>
+          <w:p>
+            <w:pPr>
+              <w:rPr>
+                <w:sz w:val="16"/>
+                <w:szCs w:val="16"/>
+              </w:rPr>
+            </w:pPr>
+            <w:r>
+              <w:rPr>
+                <w:sz w:val="16"/>
+                <w:szCs w:val="16"/>
+              </w:rPr>
+              <w:t>453,698</w:t>
+            </w:r>
+          </w:p>
+        </w:tc>
+        <w:tc>
+          <w:tcPr>
+            <w:tcW w:w="37.60pt" w:type="dxa"/>
+            <w:vAlign w:val="center"/>
+          </w:tcPr>
+          <w:p>
+            <w:pPr>
+              <w:rPr>
+                <w:sz w:val="16"/>
+                <w:szCs w:val="16"/>
+              </w:rPr>
+            </w:pPr>
+            <w:r>
+              <w:rPr>
+                <w:sz w:val="16"/>
+                <w:szCs w:val="16"/>
+              </w:rPr>
+              <w:t>0.803</w:t>
+            </w:r>
+          </w:p>
+        </w:tc>
+      </w:tr>
+      <w:tr>
+        <w:trPr>
+          <w:trHeight w:val="320"/>
+          <w:jc w:val="center"/>
+        </w:trPr>
+        <w:tc>
+          <w:tcPr>
+            <w:tcW w:w="28.20pt" w:type="dxa"/>
+            <w:vAlign w:val="center"/>
+          </w:tcPr>
+          <w:p>
+            <w:pPr>
+              <w:pStyle w:val="tablecopy"/>
+            </w:pPr>
+            <w:r>
+              <w:t>R3</w:t>
+            </w:r>
+          </w:p>
+        </w:tc>
+        <w:tc>
+          <w:tcPr>
+            <w:tcW w:w="42.55pt" w:type="dxa"/>
+            <w:vAlign w:val="center"/>
+          </w:tcPr>
+          <w:p>
+            <w:pPr>
+              <w:rPr>
+                <w:sz w:val="16"/>
+                <w:szCs w:val="16"/>
+              </w:rPr>
+            </w:pPr>
+            <w:r>
+              <w:rPr>
+                <w:sz w:val="16"/>
+                <w:szCs w:val="16"/>
+              </w:rPr>
+              <w:t>0.500</w:t>
+            </w:r>
+          </w:p>
+        </w:tc>
+        <w:tc>
+          <w:tcPr>
+            <w:tcW w:w="42.50pt" w:type="dxa"/>
+            <w:vAlign w:val="center"/>
+          </w:tcPr>
+          <w:p>
+            <w:pPr>
+              <w:rPr>
+                <w:sz w:val="16"/>
+                <w:szCs w:val="16"/>
+              </w:rPr>
+            </w:pPr>
+            <w:r>
+              <w:rPr>
+                <w:sz w:val="16"/>
+                <w:szCs w:val="16"/>
+              </w:rPr>
+              <w:t>40</w:t>
+            </w:r>
+          </w:p>
+        </w:tc>
+        <w:tc>
+          <w:tcPr>
+            <w:tcW w:w="42.55pt" w:type="dxa"/>
+            <w:vAlign w:val="center"/>
+          </w:tcPr>
+          <w:p>
+            <w:pPr>
+              <w:rPr>
+                <w:sz w:val="16"/>
+                <w:szCs w:val="16"/>
+              </w:rPr>
+            </w:pPr>
+            <w:r>
+              <w:rPr>
+                <w:sz w:val="16"/>
+                <w:szCs w:val="16"/>
+              </w:rPr>
+              <w:t>14.1</w:t>
+            </w:r>
+          </w:p>
+        </w:tc>
+        <w:tc>
+          <w:tcPr>
+            <w:tcW w:w="49.60pt" w:type="dxa"/>
+            <w:vAlign w:val="center"/>
+          </w:tcPr>
+          <w:p>
+            <w:pPr>
+              <w:rPr>
+                <w:sz w:val="16"/>
+                <w:szCs w:val="16"/>
+              </w:rPr>
+            </w:pPr>
+            <w:r>
+              <w:rPr>
+                <w:sz w:val="16"/>
+                <w:szCs w:val="16"/>
+              </w:rPr>
+              <w:t>212.105</w:t>
+            </w:r>
+          </w:p>
+        </w:tc>
+        <w:tc>
+          <w:tcPr>
+            <w:tcW w:w="37.60pt" w:type="dxa"/>
+            <w:vAlign w:val="center"/>
+          </w:tcPr>
+          <w:p>
+            <w:pPr>
+              <w:rPr>
+                <w:sz w:val="16"/>
+                <w:szCs w:val="16"/>
+              </w:rPr>
+            </w:pPr>
+            <w:r>
+              <w:rPr>
+                <w:sz w:val="16"/>
+                <w:szCs w:val="16"/>
+              </w:rPr>
+              <w:t>0.613</w:t>
+            </w:r>
+          </w:p>
+        </w:tc>
+      </w:tr>
+      <w:tr>
+        <w:trPr>
+          <w:trHeight w:val="320"/>
+          <w:jc w:val="center"/>
+        </w:trPr>
+        <w:tc>
+          <w:tcPr>
+            <w:tcW w:w="28.20pt" w:type="dxa"/>
+            <w:vAlign w:val="center"/>
+          </w:tcPr>
+          <w:p>
+            <w:pPr>
+              <w:pStyle w:val="tablecopy"/>
+            </w:pPr>
+            <w:r>
+              <w:t>R2</w:t>
+            </w:r>
+          </w:p>
+        </w:tc>
+        <w:tc>
+          <w:tcPr>
+            <w:tcW w:w="42.55pt" w:type="dxa"/>
+            <w:vAlign w:val="center"/>
+          </w:tcPr>
+          <w:p>
+            <w:pPr>
+              <w:rPr>
+                <w:sz w:val="16"/>
+                <w:szCs w:val="16"/>
+              </w:rPr>
+            </w:pPr>
+            <w:r>
+              <w:rPr>
+                <w:sz w:val="16"/>
+                <w:szCs w:val="16"/>
+              </w:rPr>
+              <w:t>0.250</w:t>
+            </w:r>
+          </w:p>
+        </w:tc>
+        <w:tc>
+          <w:tcPr>
+            <w:tcW w:w="42.50pt" w:type="dxa"/>
+            <w:vAlign w:val="center"/>
+          </w:tcPr>
+          <w:p>
+            <w:pPr>
+              <w:rPr>
+                <w:sz w:val="16"/>
+                <w:szCs w:val="16"/>
+              </w:rPr>
+            </w:pPr>
+            <w:r>
+              <w:rPr>
+                <w:sz w:val="16"/>
+                <w:szCs w:val="16"/>
+              </w:rPr>
+              <w:t>46</w:t>
+            </w:r>
+          </w:p>
+        </w:tc>
+        <w:tc>
+          <w:tcPr>
+            <w:tcW w:w="42.55pt" w:type="dxa"/>
+            <w:vAlign w:val="center"/>
+          </w:tcPr>
+          <w:p>
+            <w:pPr>
+              <w:rPr>
+                <w:sz w:val="16"/>
+                <w:szCs w:val="16"/>
+              </w:rPr>
+            </w:pPr>
+            <w:r>
+              <w:rPr>
+                <w:sz w:val="16"/>
+                <w:szCs w:val="16"/>
+              </w:rPr>
+              <w:t>3.4</w:t>
+            </w:r>
+          </w:p>
+        </w:tc>
+        <w:tc>
+          <w:tcPr>
+            <w:tcW w:w="49.60pt" w:type="dxa"/>
+            <w:vAlign w:val="center"/>
+          </w:tcPr>
+          <w:p>
+            <w:pPr>
+              <w:rPr>
+                <w:sz w:val="16"/>
+                <w:szCs w:val="16"/>
+              </w:rPr>
+            </w:pPr>
+            <w:r>
+              <w:rPr>
+                <w:sz w:val="16"/>
+                <w:szCs w:val="16"/>
+              </w:rPr>
+              <w:t>55,374</w:t>
+            </w:r>
+          </w:p>
+        </w:tc>
+        <w:tc>
+          <w:tcPr>
+            <w:tcW w:w="37.60pt" w:type="dxa"/>
+            <w:vAlign w:val="center"/>
+          </w:tcPr>
+          <w:p>
+            <w:pPr>
+              <w:rPr>
+                <w:sz w:val="16"/>
+                <w:szCs w:val="16"/>
+              </w:rPr>
+            </w:pPr>
+            <w:r>
+              <w:rPr>
+                <w:sz w:val="16"/>
+                <w:szCs w:val="16"/>
+              </w:rPr>
+              <w:t>0.305</w:t>
+            </w:r>
+          </w:p>
+        </w:tc>
+      </w:tr>
+      <w:tr>
+        <w:trPr>
+          <w:trHeight w:val="320"/>
+          <w:jc w:val="center"/>
+        </w:trPr>
+        <w:tc>
+          <w:tcPr>
+            <w:tcW w:w="28.20pt" w:type="dxa"/>
+            <w:vAlign w:val="center"/>
+          </w:tcPr>
+          <w:p>
+            <w:pPr>
+              <w:pStyle w:val="tablecopy"/>
+            </w:pPr>
+            <w:r>
+              <w:t>R1</w:t>
+            </w:r>
+          </w:p>
+        </w:tc>
+        <w:tc>
+          <w:tcPr>
+            <w:tcW w:w="42.55pt" w:type="dxa"/>
+            <w:vAlign w:val="center"/>
+          </w:tcPr>
+          <w:p>
+            <w:pPr>
+              <w:rPr>
+                <w:sz w:val="16"/>
+                <w:szCs w:val="16"/>
+              </w:rPr>
+            </w:pPr>
+            <w:r>
+              <w:rPr>
+                <w:sz w:val="16"/>
+                <w:szCs w:val="16"/>
+              </w:rPr>
+              <w:t>0.125</w:t>
+            </w:r>
+          </w:p>
+        </w:tc>
+        <w:tc>
+          <w:tcPr>
+            <w:tcW w:w="42.50pt" w:type="dxa"/>
+            <w:vAlign w:val="center"/>
+          </w:tcPr>
+          <w:p>
+            <w:pPr>
+              <w:rPr>
+                <w:sz w:val="16"/>
+                <w:szCs w:val="16"/>
+              </w:rPr>
+            </w:pPr>
+            <w:r>
+              <w:rPr>
+                <w:sz w:val="16"/>
+                <w:szCs w:val="16"/>
+              </w:rPr>
+              <w:t>51</w:t>
+            </w:r>
+          </w:p>
+        </w:tc>
+        <w:tc>
+          <w:tcPr>
+            <w:tcW w:w="42.55pt" w:type="dxa"/>
+            <w:vAlign w:val="center"/>
+          </w:tcPr>
+          <w:p>
+            <w:pPr>
+              <w:rPr>
+                <w:sz w:val="16"/>
+                <w:szCs w:val="16"/>
+              </w:rPr>
+            </w:pPr>
+            <w:r>
+              <w:rPr>
+                <w:sz w:val="16"/>
+                <w:szCs w:val="16"/>
+              </w:rPr>
+              <w:t>0.9</w:t>
+            </w:r>
+          </w:p>
+        </w:tc>
+        <w:tc>
+          <w:tcPr>
+            <w:tcW w:w="49.60pt" w:type="dxa"/>
+            <w:vAlign w:val="center"/>
+          </w:tcPr>
+          <w:p>
+            <w:pPr>
+              <w:rPr>
+                <w:sz w:val="16"/>
+                <w:szCs w:val="16"/>
+              </w:rPr>
+            </w:pPr>
+            <w:r>
+              <w:rPr>
+                <w:sz w:val="16"/>
+                <w:szCs w:val="16"/>
+              </w:rPr>
+              <w:t>14,057</w:t>
+            </w:r>
+          </w:p>
+        </w:tc>
+        <w:tc>
+          <w:tcPr>
+            <w:tcW w:w="37.60pt" w:type="dxa"/>
+            <w:vAlign w:val="center"/>
+          </w:tcPr>
+          <w:p>
+            <w:pPr>
+              <w:rPr>
+                <w:sz w:val="16"/>
+                <w:szCs w:val="16"/>
+              </w:rPr>
+            </w:pPr>
+            <w:r>
+              <w:rPr>
+                <w:sz w:val="16"/>
+                <w:szCs w:val="16"/>
+              </w:rPr>
+              <w:t>0.000</w:t>
+            </w:r>
+          </w:p>
+        </w:tc>
+      </w:tr>
+    </w:tbl>
+    <w:p>
+      <w:pPr>
+        <w:jc w:val="both"/>
+        <w:rPr>
+          <w:spacing w:val="-1"/>
+          <w:lang w:eastAsia="x-none"/>
+        </w:rPr>
+      </w:pPr>
+    </w:p>
+    <w:p>
+      <w:pPr>
+        <w:jc w:val="both"/>
+        <w:rPr>
+          <w:spacing w:val="-1"/>
+          <w:lang w:eastAsia="x-none"/>
+        </w:rPr>
+      </w:pPr>
+      <w:r>
+        <w:rPr>
+          <w:spacing w:val="-1"/>
+          <w:lang w:eastAsia="x-none"/>
+        </w:rPr>
+        <w:t>The</w:t>
+      </w:r>
+      <w:r>
+        <w:rPr>
+          <w:spacing w:val="-1"/>
+          <w:lang w:eastAsia="x-none"/>
+        </w:rPr>
+        <w:t xml:space="preserve"> </w:t>
+      </w:r>
+      <w:r>
+        <w:rPr>
+          <w:spacing w:val="-1"/>
+          <w:lang w:eastAsia="x-none"/>
+        </w:rPr>
+        <w:t>action selects one of the six tiers for the next 10-frame segment.</w:t>
+      </w:r>
+    </w:p>
+    <w:p>
+      <w:pPr>
+        <w:pStyle w:val="Heading2"/>
+      </w:pPr>
+      <w:r>
+        <w:t>Reward</w:t>
+      </w:r>
+    </w:p>
+    <w:p>
+      <w:pPr>
+        <w:ind w:firstLine="14.40pt"/>
+        <w:jc w:val="both"/>
+      </w:pPr>
+      <w:r>
+        <w:t>Training and evaluation use exactly the same additive objective. Let (</w:t>
+      </w:r>
+      <w:proofErr w:type="spellStart"/>
+      <w:r>
+        <w:t>S_t</w:t>
+      </w:r>
+      <w:proofErr w:type="spellEnd"/>
+      <w:r>
+        <w:t>) contain the (</w:t>
+      </w:r>
+      <w:proofErr w:type="spellStart"/>
+      <w:r>
+        <w:t>n_t</w:t>
+      </w:r>
+      <w:proofErr w:type="spellEnd"/>
+      <w:r>
+        <w:t>) frames requested in segment (t), let (N) be the episode's total frame count, and let (q_{</w:t>
+      </w:r>
+      <w:proofErr w:type="spellStart"/>
+      <w:proofErr w:type="gramStart"/>
+      <w:r>
+        <w:t>t,i</w:t>
+      </w:r>
+      <w:proofErr w:type="spellEnd"/>
+      <w:proofErr w:type="gramEnd"/>
+      <w:r>
+        <w:t>}\</w:t>
+      </w:r>
+      <w:proofErr w:type="gramStart"/>
+      <w:r>
+        <w:t>in[</w:t>
+      </w:r>
+      <w:proofErr w:type="gramEnd"/>
+      <w:r>
+        <w:t xml:space="preserve">0,1]) and (\bar </w:t>
+      </w:r>
+      <w:proofErr w:type="spellStart"/>
+      <w:r>
+        <w:t>q_t</w:t>
+      </w:r>
+      <w:proofErr w:type="spellEnd"/>
+      <w:r>
+        <w:t>) denote the frame utility and segment-mean utility, respectively. The per-segment reward has five terms:</w:t>
+      </w:r>
+    </w:p>
+    <w:p>
+      <w:pPr>
+        <w:jc w:val="both"/>
+      </w:pPr>
+    </w:p>
+    <w:p>
+      <w:pPr>
+        <w:pStyle w:val="BodyText"/>
         <w:rPr>
           <w:lang w:val="en-US"/>
         </w:rPr>
       </w:pPr>
-      <w:r>
-        <w:t xml:space="preserve">Number equations consecutively. Equation numbers, within parentheses, are to position flush right, as in (1), using a right tab stop. To make your equations more compact, you </w:t>
-      </w:r>
-      <w:r>
-        <w:lastRenderedPageBreak/>
-        <w:t>may use the solidus ( / ), the exp function, or appropriate exponents. Italicize Roman symbols for quantities and variables, but not Greek symbols. Use a long dash rather than a hyphen for a minus sign. Punctuate equations with commas or periods when they are part of a sentence, as in</w:t>
-      </w:r>
-      <w:r>
-        <w:rPr>
-          <w:lang w:val="en-US"/>
-        </w:rPr>
-        <w:t>:</w:t>
-      </w:r>
     </w:p>
     <w:p>
       <w:pPr>
@@ -1224,10 +2861,7 @@
         <w:pStyle w:val="BodyText"/>
       </w:pPr>
       <w:r>
-        <w:t xml:space="preserve">After the text edit has been completed, the paper is ready for the template. Duplicate the template file by using the Save As command, and use the naming convention prescribed by your conference for the name of your paper. In this newly created file, highlight all of the contents and import your </w:t>
-      </w:r>
-      <w:r>
-        <w:t>prepared text file. You are now ready to style your paper; use the scroll down window on the left of the MS Word Formatting toolbar.</w:t>
+        <w:t>After the text edit has been completed, the paper is ready for the template. Duplicate the template file by using the Save As command, and use the naming convention prescribed by your conference for the name of your paper. In this newly created file, highlight all of the contents and import your prepared text file. You are now ready to style your paper; use the scroll down window on the left of the MS Word Formatting toolbar.</w:t>
       </w:r>
     </w:p>
     <w:p>
@@ -1480,6 +3114,7 @@
         <w:pStyle w:val="BodyText"/>
       </w:pPr>
       <w:r>
+        <w:lastRenderedPageBreak/>
         <w:t>Text heads organize the topics on a relational, hierarchical basis. For example, the paper title is the primary text head because all subsequent material relates and elaborates on this one topic. If there are two or more sub-topics, the next level head (uppercase Roman numerals) should be used and, conversely, if there are not at least two sub-topics, then no subheads should be introduced. Styles named “Heading 1”, “Heading 2”, “Heading 3”, and “Heading 4” are prescribed.</w:t>
       </w:r>
     </w:p>
@@ -1555,7 +3190,6 @@
               <w:pStyle w:val="tablecolhead"/>
             </w:pPr>
             <w:r>
-              <w:lastRenderedPageBreak/>
               <w:t>Table Head</w:t>
             </w:r>
           </w:p>
@@ -1917,7 +3551,10 @@
         <w:pStyle w:val="BodyText"/>
       </w:pPr>
       <w:r>
-        <w:t>Number footnotes separately in superscripts. Place the actual footnote at the bottom of the column in which it was cited. Do not put footnotes in the</w:t>
+        <w:t xml:space="preserve">Number footnotes separately in superscripts. Place the actual footnote at the bottom of the column in which it was </w:t>
+      </w:r>
+      <w:r>
+        <w:t>cited. Do not put footnotes in the</w:t>
       </w:r>
       <w:r>
         <w:rPr>
@@ -2069,7 +3706,7 @@
       <w:r>
         <w:t xml:space="preserve"> Code Ocean, Aug. 2023. [Online]. Available: </w:t>
       </w:r>
-      <w:hyperlink r:id="rId9" w:history="1">
+      <w:hyperlink r:id="rId11" w:history="1">
         <w:r>
           <w:t>https://codeocean.com/capsule/4989235/tree</w:t>
         </w:r>
@@ -2108,7 +3745,7 @@
       <w:r>
         <w:t xml:space="preserve"> 2013, arXiv:1312.6114. [Online]. Available: </w:t>
       </w:r>
-      <w:hyperlink r:id="rId10" w:history="1">
+      <w:hyperlink r:id="rId12" w:history="1">
         <w:r>
           <w:t>https://arxiv.org/abs/1312.6114</w:t>
         </w:r>
@@ -4657,6 +6294,34 @@
       <w:shd w:val="clear" w:color="auto" w:fill="E1DFDD"/>
     </w:rPr>
   </w:style>
+  <w:style w:type="character" w:styleId="PlaceholderText">
+    <w:name w:val="Placeholder Text"/>
+    <w:basedOn w:val="DefaultParagraphFont"/>
+    <w:uiPriority w:val="99"/>
+    <w:semiHidden/>
+    <w:rsid w:val="00D11748"/>
+    <w:rPr>
+      <w:color w:val="666666"/>
+    </w:rPr>
+  </w:style>
+  <w:style w:type="paragraph" w:styleId="Caption">
+    <w:name w:val="caption"/>
+    <w:basedOn w:val="Normal"/>
+    <w:next w:val="Normal"/>
+    <w:unhideWhenUsed/>
+    <w:qFormat/>
+    <w:rsid w:val="00F859AF"/>
+    <w:pPr>
+      <w:spacing w:after="10pt"/>
+    </w:pPr>
+    <w:rPr>
+      <w:i/>
+      <w:iCs/>
+      <w:color w:val="44546A" w:themeColor="text2"/>
+      <w:sz w:val="18"/>
+      <w:szCs w:val="18"/>
+    </w:rPr>
+  </w:style>
 </w:styles>
 </file>
 

</xml_diff>